<commit_message>
Fixado bug do markdown
</commit_message>
<xml_diff>
--- a/output/relatorio_trimestral_2026T2.docx
+++ b/output/relatorio_trimestral_2026T2.docx
@@ -2,263 +2,6 @@
 <file path=word/document.xml><?xml version="1.0" encoding="utf-8"?>
 <w:document xmlns:w="http://schemas.openxmlformats.org/wordprocessingml/2006/main" xmlns:m="http://schemas.openxmlformats.org/officeDocument/2006/math" xmlns:r="http://schemas.openxmlformats.org/officeDocument/2006/relationships" xmlns:o="urn:schemas-microsoft-com:office:office" xmlns:v="urn:schemas-microsoft-com:vml" xmlns:w10="urn:schemas-microsoft-com:office:word" xmlns:a="http://schemas.openxmlformats.org/drawingml/2006/main" xmlns:pic="http://schemas.openxmlformats.org/drawingml/2006/picture" xmlns:wp="http://schemas.openxmlformats.org/drawingml/2006/wordprocessingDrawing">
   <w:body>
-    <w:bookmarkStart w:id="98" w:name="X00dce59718111640761be3ce6cac07bd4bdd845"/>
-    <w:p>
-      <w:pPr>
-        <w:pStyle w:val="Heading1"/>
-      </w:pPr>
-      <w:r>
-        <w:t xml:space="preserve">Ocupação e rendimento nos estratos do Piauí — 2º trimestre de 2026</w:t>
-      </w:r>
-    </w:p>
-    <w:p>
-      <w:pPr>
-        <w:pStyle w:val="BlockText"/>
-      </w:pPr>
-      <w:r>
-        <w:t xml:space="preserve">Duas construções são resolvidas pelo script: as diretivas</w:t>
-      </w:r>
-      <w:r>
-        <w:t xml:space="preserve"> </w:t>
-      </w:r>
-      <w:r>
-        <w:rPr>
-          <w:rStyle w:val="VerbatimChar"/>
-        </w:rPr>
-        <w:t xml:space="preserve">&lt;!-- @tabela ... --&gt;</w:t>
-      </w:r>
-      <w:r>
-        <w:t xml:space="preserve">, que viram tabelas inteiras, e as expressões</w:t>
-      </w:r>
-      <w:r>
-        <w:t xml:space="preserve"> </w:t>
-      </w:r>
-      <w:r>
-        <w:rPr>
-          <w:rStyle w:val="VerbatimChar"/>
-        </w:rPr>
-        <w:t xml:space="preserve">{{est Indicador Geografia}}</w:t>
-      </w:r>
-      <w:r>
-        <w:t xml:space="preserve">, que viram números. Uma terceira,</w:t>
-      </w:r>
-      <w:r>
-        <w:t xml:space="preserve"> </w:t>
-      </w:r>
-      <w:r>
-        <w:rPr>
-          <w:rStyle w:val="VerbatimChar"/>
-        </w:rPr>
-        <w:t xml:space="preserve">&lt;!-- @redigir: ... --&gt;</w:t>
-      </w:r>
-      <w:r>
-        <w:t xml:space="preserve">, marca o que depende de leitura humana e sai no</w:t>
-      </w:r>
-      <w:r>
-        <w:t xml:space="preserve"> </w:t>
-      </w:r>
-      <w:r>
-        <w:t xml:space="preserve">arquivo gerado como um bloco</w:t>
-      </w:r>
-      <w:r>
-        <w:t xml:space="preserve"> </w:t>
-      </w:r>
-      <w:r>
-        <w:rPr>
-          <w:bCs/>
-          <w:b/>
-        </w:rPr>
-        <w:t xml:space="preserve">A REDIGIR</w:t>
-      </w:r>
-      <w:r>
-        <w:t xml:space="preserve"> </w:t>
-      </w:r>
-      <w:r>
-        <w:t xml:space="preserve">— são os trechos de</w:t>
-      </w:r>
-      <w:r>
-        <w:t xml:space="preserve"> </w:t>
-      </w:r>
-      <w:r>
-        <w:t xml:space="preserve">interpretação, que nenhuma consulta a CSV resolve.</w:t>
-      </w:r>
-    </w:p>
-    <w:p>
-      <w:pPr>
-        <w:pStyle w:val="BlockText"/>
-      </w:pPr>
-      <w:r>
-        <w:t xml:space="preserve">O script FALHA se sobrar qualquer marcador não resolvido, de propósito: um</w:t>
-      </w:r>
-      <w:r>
-        <w:t xml:space="preserve"> </w:t>
-      </w:r>
-      <w:r>
-        <w:t xml:space="preserve">relatório meio preenchido publicado por engano é pior que nenhum.</w:t>
-      </w:r>
-    </w:p>
-    <w:p>
-      <w:pPr>
-        <w:pStyle w:val="BlockText"/>
-      </w:pPr>
-      <w:r>
-        <w:rPr>
-          <w:bCs/>
-          <w:b/>
-        </w:rPr>
-        <w:t xml:space="preserve">Regra que decide o que entra no corpo do texto:</w:t>
-      </w:r>
-      <w:r>
-        <w:t xml:space="preserve"> </w:t>
-      </w:r>
-      <w:r>
-        <w:t xml:space="preserve">um recorte demográfico</w:t>
-      </w:r>
-      <w:r>
-        <w:t xml:space="preserve"> </w:t>
-      </w:r>
-      <w:r>
-        <w:t xml:space="preserve">só é comentado aqui se,</w:t>
-      </w:r>
-      <w:r>
-        <w:t xml:space="preserve"> </w:t>
-      </w:r>
-      <w:r>
-        <w:rPr>
-          <w:iCs/>
-          <w:i/>
-        </w:rPr>
-        <w:t xml:space="preserve">naquele recorte geográfico</w:t>
-      </w:r>
-      <w:r>
-        <w:t xml:space="preserve">, a diferença for</w:t>
-      </w:r>
-      <w:r>
-        <w:t xml:space="preserve"> </w:t>
-      </w:r>
-      <w:r>
-        <w:t xml:space="preserve">significativa</w:t>
-      </w:r>
-      <w:r>
-        <w:t xml:space="preserve"> </w:t>
-      </w:r>
-      <w:r>
-        <w:rPr>
-          <w:bCs/>
-          <w:b/>
-        </w:rPr>
-        <w:t xml:space="preserve">pelo p-valor ajustado</w:t>
-      </w:r>
-      <w:r>
-        <w:t xml:space="preserve"> </w:t>
-      </w:r>
-      <w:r>
-        <w:t xml:space="preserve">(coluna</w:t>
-      </w:r>
-      <w:r>
-        <w:t xml:space="preserve"> </w:t>
-      </w:r>
-      <w:r>
-        <w:rPr>
-          <w:rStyle w:val="VerbatimChar"/>
-        </w:rPr>
-        <w:t xml:space="preserve">p_ajustado</w:t>
-      </w:r>
-      <w:r>
-        <w:t xml:space="preserve">, que corrige o</w:t>
-      </w:r>
-      <w:r>
-        <w:t xml:space="preserve"> </w:t>
-      </w:r>
-      <w:r>
-        <w:t xml:space="preserve">volume de comparações)</w:t>
-      </w:r>
-      <w:r>
-        <w:t xml:space="preserve"> </w:t>
-      </w:r>
-      <w:r>
-        <w:rPr>
-          <w:bCs/>
-          <w:b/>
-        </w:rPr>
-        <w:t xml:space="preserve">e</w:t>
-      </w:r>
-      <w:r>
-        <w:t xml:space="preserve"> </w:t>
-      </w:r>
-      <w:r>
-        <w:t xml:space="preserve">o CV ficar abaixo de 15% em</w:t>
-      </w:r>
-      <w:r>
-        <w:t xml:space="preserve"> </w:t>
-      </w:r>
-      <w:r>
-        <w:rPr>
-          <w:bCs/>
-          <w:b/>
-        </w:rPr>
-        <w:t xml:space="preserve">todas</w:t>
-      </w:r>
-      <w:r>
-        <w:t xml:space="preserve"> </w:t>
-      </w:r>
-      <w:r>
-        <w:t xml:space="preserve">as</w:t>
-      </w:r>
-      <w:r>
-        <w:t xml:space="preserve"> </w:t>
-      </w:r>
-      <w:r>
-        <w:t xml:space="preserve">categorias demográficas e em</w:t>
-      </w:r>
-      <w:r>
-        <w:t xml:space="preserve"> </w:t>
-      </w:r>
-      <w:r>
-        <w:rPr>
-          <w:bCs/>
-          <w:b/>
-        </w:rPr>
-        <w:t xml:space="preserve">todas</w:t>
-      </w:r>
-      <w:r>
-        <w:t xml:space="preserve"> </w:t>
-      </w:r>
-      <w:r>
-        <w:t xml:space="preserve">as categorias geográficas do recorte.</w:t>
-      </w:r>
-      <w:r>
-        <w:t xml:space="preserve"> </w:t>
-      </w:r>
-      <w:r>
-        <w:t xml:space="preserve">Basta uma célula acima de 15% para o recorte inteiro sair do corpo do texto e</w:t>
-      </w:r>
-      <w:r>
-        <w:t xml:space="preserve"> </w:t>
-      </w:r>
-      <w:r>
-        <w:t xml:space="preserve">ir para o anexo metodológico. A regra é conservadora de propósito: comentar</w:t>
-      </w:r>
-      <w:r>
-        <w:t xml:space="preserve"> </w:t>
-      </w:r>
-      <w:r>
-        <w:t xml:space="preserve">uma diferença entre homens e mulheres que só aparece em metade dos estratos —</w:t>
-      </w:r>
-      <w:r>
-        <w:t xml:space="preserve"> </w:t>
-      </w:r>
-      <w:r>
-        <w:t xml:space="preserve">e some na outra metade por imprecisão amostral — é pior do que não comentar.</w:t>
-      </w:r>
-    </w:p>
-    <w:p>
-      <w:r>
-        <w:pict>
-          <v:rect style="width:0;height:1.5pt" o:hralign="center" o:hrstd="t" o:hr="t"/>
-        </w:pict>
-      </w:r>
-    </w:p>
     <w:bookmarkStart w:id="20" w:name="introdução"/>
     <w:p>
       <w:pPr>
@@ -266,69 +9,6 @@
       </w:pPr>
       <w:r>
         <w:t xml:space="preserve">1 Introdução</w:t>
-      </w:r>
-    </w:p>
-    <w:p>
-      <w:pPr>
-        <w:pStyle w:val="FirstParagraph"/>
-      </w:pPr>
-      <w:r>
-        <w:rPr>
-          <w:bCs/>
-          <w:b/>
-        </w:rPr>
-        <w:t xml:space="preserve">Tabela 1</w:t>
-      </w:r>
-      <w:r>
-        <w:t xml:space="preserve"> </w:t>
-      </w:r>
-      <w:r>
-        <w:t xml:space="preserve">— Indicadores de trabalho e rendimento — Brasil, Nordeste, Piauí e</w:t>
-      </w:r>
-      <w:r>
-        <w:t xml:space="preserve"> </w:t>
-      </w:r>
-      <w:r>
-        <w:t xml:space="preserve">Teresina — até 2º trimestre de 2026</w:t>
-      </w:r>
-    </w:p>
-    <w:p>
-      <w:pPr>
-        <w:pStyle w:val="BlockText"/>
-      </w:pPr>
-      <w:r>
-        <w:rPr>
-          <w:bCs/>
-          <w:b/>
-        </w:rPr>
-        <w:t xml:space="preserve">A REDIGIR</w:t>
-      </w:r>
-      <w:r>
-        <w:t xml:space="preserve"> </w:t>
-      </w:r>
-      <w:r>
-        <w:t xml:space="preserve">— manter a Tabela 1 do relatorio.docx (série histórica de Brasil, Nordeste, Piauí e Teresina), acrescentando a coluna do trimestre corrente. Ela não é gerada pelo pipeline, que estima um trimestre por vez.</w:t>
-      </w:r>
-    </w:p>
-    <w:p>
-      <w:pPr>
-        <w:pStyle w:val="FirstParagraph"/>
-      </w:pPr>
-      <w:r>
-        <w:t xml:space="preserve">Fonte: IBGE — Pesquisa Nacional por Amostra de Domicílios Contínua trimestral.</w:t>
-      </w:r>
-      <w:r>
-        <w:t xml:space="preserve"> </w:t>
-      </w:r>
-      <w:r>
-        <w:t xml:space="preserve">Elaboração própria.</w:t>
-      </w:r>
-    </w:p>
-    <w:p>
-      <w:r>
-        <w:pict>
-          <v:rect style="width:0;height:1.5pt" o:hralign="center" o:hrstd="t" o:hr="t"/>
-        </w:pict>
       </w:r>
     </w:p>
     <w:bookmarkEnd w:id="20"/>
@@ -390,31 +70,15 @@
         <w:t xml:space="preserve">2.5 Comparações entre os recortes</w:t>
       </w:r>
     </w:p>
-    <w:p>
-      <w:r>
-        <w:pict>
-          <v:rect style="width:0;height:1.5pt" o:hralign="center" o:hrstd="t" o:hr="t"/>
-        </w:pict>
-      </w:r>
-    </w:p>
     <w:bookmarkEnd w:id="25"/>
     <w:bookmarkEnd w:id="26"/>
-    <w:bookmarkStart w:id="96" w:name="análise-dos-resultados"/>
+    <w:bookmarkStart w:id="95" w:name="análise-dos-resultados"/>
     <w:p>
       <w:pPr>
         <w:pStyle w:val="Heading2"/>
       </w:pPr>
       <w:r>
         <w:t xml:space="preserve">3 Análise dos resultados</w:t>
-      </w:r>
-    </w:p>
-    <w:bookmarkStart w:id="27" w:name="como-ler-esta-seção"/>
-    <w:p>
-      <w:pPr>
-        <w:pStyle w:val="Heading3"/>
-      </w:pPr>
-      <w:r>
-        <w:t xml:space="preserve">3.1 Como ler esta seção</w:t>
       </w:r>
     </w:p>
     <w:p>
@@ -434,19 +98,13 @@
         <w:t xml:space="preserve"> </w:t>
       </w:r>
       <w:r>
-        <w:t xml:space="preserve">qualificam a resposta. Cada uma traz uma tabela com as estimativas por recorte</w:t>
+        <w:t xml:space="preserve">qualificam a resposta. Cada uma traz as estimativas por recorte</w:t>
       </w:r>
       <w:r>
         <w:t xml:space="preserve"> </w:t>
       </w:r>
       <w:r>
-        <w:t xml:space="preserve">geográfico, um gráfico com os intervalos de confiança e um texto que aponta as</w:t>
-      </w:r>
-      <w:r>
-        <w:t xml:space="preserve"> </w:t>
-      </w:r>
-      <w:r>
-        <w:t xml:space="preserve">diferenças relevantes.</w:t>
+        <w:t xml:space="preserve">geográfico e um texto que aponta as diferenças relevantes.</w:t>
       </w:r>
     </w:p>
     <w:p>
@@ -454,7 +112,19 @@
         <w:pStyle w:val="BodyText"/>
       </w:pPr>
       <w:r>
-        <w:t xml:space="preserve">Três chaves de leitura ajudam a interpretar os números:</w:t>
+        <w:t xml:space="preserve">Três chaves de leitura ajudam a interpretar os números: Primeiro, o intervalo importa mais que o ponto. Toda estimativa aqui vem de uma amostra. Quando os intervalos de confiança das estimativas de dois estratos se</w:t>
+      </w:r>
+      <w:r>
+        <w:t xml:space="preserve"> </w:t>
+      </w:r>
+      <w:r>
+        <w:t xml:space="preserve">sobrepõem, a diferença entre eles pode ser apenas ruído amostral, mesmo que os</w:t>
+      </w:r>
+      <w:r>
+        <w:t xml:space="preserve"> </w:t>
+      </w:r>
+      <w:r>
+        <w:t xml:space="preserve">valores centrais pareçam distantes.</w:t>
       </w:r>
     </w:p>
     <w:p>
@@ -462,41 +132,63 @@
         <w:pStyle w:val="BodyText"/>
       </w:pPr>
       <w:r>
+        <w:t xml:space="preserve">Segundo, Nem toda estimativa tem o mesmo peso. A coluna de precisão classifica cada</w:t>
+      </w:r>
+      <w:r>
+        <w:t xml:space="preserve"> </w:t>
+      </w:r>
+      <w:r>
+        <w:t xml:space="preserve">número pelo coeficiente de variação: quanto menor, mais confiável. Estimativas</w:t>
+      </w:r>
+      <w:r>
+        <w:t xml:space="preserve"> </w:t>
+      </w:r>
+      <w:r>
+        <w:t xml:space="preserve">marcadas como</w:t>
+      </w:r>
+      <w:r>
+        <w:t xml:space="preserve"> </w:t>
+      </w:r>
+      <w:r>
         <w:rPr>
-          <w:bCs/>
-          <w:b/>
+          <w:iCs/>
+          <w:i/>
         </w:rPr>
-        <w:t xml:space="preserve">O intervalo importa mais que o ponto.</w:t>
+        <w:t xml:space="preserve">regular</w:t>
       </w:r>
       <w:r>
         <w:t xml:space="preserve"> </w:t>
       </w:r>
       <w:r>
-        <w:t xml:space="preserve">Toda estimativa aqui vem de uma</w:t>
+        <w:t xml:space="preserve">devem ser lidas com cautela; as marcadas como</w:t>
       </w:r>
       <w:r>
         <w:t xml:space="preserve"> </w:t>
       </w:r>
       <w:r>
-        <w:t xml:space="preserve">amostra, não de um censo. Quando os intervalos de confiança de dois estratos se</w:t>
+        <w:rPr>
+          <w:iCs/>
+          <w:i/>
+        </w:rPr>
+        <w:t xml:space="preserve">baixa</w:t>
       </w:r>
       <w:r>
         <w:t xml:space="preserve"> </w:t>
       </w:r>
       <w:r>
-        <w:t xml:space="preserve">sobrepõem, a diferença entre eles pode ser apenas ruído amostral — mesmo que os</w:t>
+        <w:t xml:space="preserve">aparecem na tabela por completude, mas não sustentam conclusão. Isso é</w:t>
       </w:r>
       <w:r>
         <w:t xml:space="preserve"> </w:t>
       </w:r>
       <w:r>
-        <w:t xml:space="preserve">valores centrais pareçam distantes. Por isso o gráfico mostra a barra inteira,</w:t>
+        <w:t xml:space="preserve">esperado — quanto mais fino o recorte territorial, menos pessoas da amostra</w:t>
       </w:r>
       <w:r>
         <w:t xml:space="preserve"> </w:t>
       </w:r>
       <w:r>
-        <w:t xml:space="preserve">e não só o ponto.</w:t>
+        <w:t xml:space="preserve">caem dentro dele.</w:t>
       </w:r>
     </w:p>
     <w:p>
@@ -504,103 +196,19 @@
         <w:pStyle w:val="BodyText"/>
       </w:pPr>
       <w:r>
-        <w:rPr>
-          <w:bCs/>
-          <w:b/>
-        </w:rPr>
-        <w:t xml:space="preserve">Nem toda estimativa tem o mesmo peso.</w:t>
+        <w:t xml:space="preserve">Por fim, a última linha de cada</w:t>
       </w:r>
       <w:r>
         <w:t xml:space="preserve"> </w:t>
       </w:r>
       <w:r>
-        <w:t xml:space="preserve">A coluna de precisão classifica cada</w:t>
+        <w:t xml:space="preserve">tabela traz o teste que responde se as diferenças entre as categorias daquele</w:t>
       </w:r>
       <w:r>
         <w:t xml:space="preserve"> </w:t>
       </w:r>
       <w:r>
-        <w:t xml:space="preserve">número pelo coeficiente de variação: quanto menor, mais confiável. Estimativas</w:t>
-      </w:r>
-      <w:r>
-        <w:t xml:space="preserve"> </w:t>
-      </w:r>
-      <w:r>
-        <w:t xml:space="preserve">marcadas como</w:t>
-      </w:r>
-      <w:r>
-        <w:t xml:space="preserve"> </w:t>
-      </w:r>
-      <w:r>
-        <w:rPr>
-          <w:iCs/>
-          <w:i/>
-        </w:rPr>
-        <w:t xml:space="preserve">regular</w:t>
-      </w:r>
-      <w:r>
-        <w:t xml:space="preserve"> </w:t>
-      </w:r>
-      <w:r>
-        <w:t xml:space="preserve">devem ser lidas com cautela; as marcadas como</w:t>
-      </w:r>
-      <w:r>
-        <w:t xml:space="preserve"> </w:t>
-      </w:r>
-      <w:r>
-        <w:rPr>
-          <w:iCs/>
-          <w:i/>
-        </w:rPr>
-        <w:t xml:space="preserve">baixa</w:t>
-      </w:r>
-      <w:r>
-        <w:t xml:space="preserve"> </w:t>
-      </w:r>
-      <w:r>
-        <w:t xml:space="preserve">aparecem na tabela por completude, mas não sustentam conclusão. Isso é</w:t>
-      </w:r>
-      <w:r>
-        <w:t xml:space="preserve"> </w:t>
-      </w:r>
-      <w:r>
-        <w:t xml:space="preserve">esperado — quanto mais fino o recorte territorial, menos pessoas da amostra</w:t>
-      </w:r>
-      <w:r>
-        <w:t xml:space="preserve"> </w:t>
-      </w:r>
-      <w:r>
-        <w:t xml:space="preserve">caem dentro dele.</w:t>
-      </w:r>
-    </w:p>
-    <w:p>
-      <w:pPr>
-        <w:pStyle w:val="BodyText"/>
-      </w:pPr>
-      <w:r>
-        <w:rPr>
-          <w:bCs/>
-          <w:b/>
-        </w:rPr>
-        <w:t xml:space="preserve">Diferença visível não é diferença comprovada.</w:t>
-      </w:r>
-      <w:r>
-        <w:t xml:space="preserve"> </w:t>
-      </w:r>
-      <w:r>
-        <w:t xml:space="preserve">A última linha de cada</w:t>
-      </w:r>
-      <w:r>
-        <w:t xml:space="preserve"> </w:t>
-      </w:r>
-      <w:r>
-        <w:t xml:space="preserve">tabela traz o teste que responde se as diferenças entre as categorias daquele</w:t>
-      </w:r>
-      <w:r>
-        <w:t xml:space="preserve"> </w:t>
-      </w:r>
-      <w:r>
-        <w:t xml:space="preserve">recorte são estatisticamente significativas. É esse teste, e não a inspeção</w:t>
+        <w:t xml:space="preserve">recorte são estatisticamente significativas - os testes descritos na seção 2.5. É esse teste, e não a inspeção</w:t>
       </w:r>
       <w:r>
         <w:t xml:space="preserve"> </w:t>
@@ -640,21 +248,22 @@
         <w:t xml:space="preserve">desconta esse efeito.</w:t>
       </w:r>
     </w:p>
-    <w:p>
-      <w:r>
-        <w:pict>
-          <v:rect style="width:0;height:1.5pt" o:hralign="center" o:hrstd="t" o:hr="t"/>
-        </w:pict>
-      </w:r>
-    </w:p>
-    <w:bookmarkEnd w:id="27"/>
-    <w:bookmarkStart w:id="40" w:name="desocupação"/>
+    <w:bookmarkStart w:id="39" w:name="desocupação"/>
     <w:p>
       <w:pPr>
         <w:pStyle w:val="Heading3"/>
       </w:pPr>
       <w:r>
         <w:t xml:space="preserve">3.2 Desocupação</w:t>
+      </w:r>
+    </w:p>
+    <w:bookmarkStart w:id="30" w:name="taxa-de-desocupação"/>
+    <w:p>
+      <w:pPr>
+        <w:pStyle w:val="Heading4"/>
+      </w:pPr>
+      <w:r>
+        <w:t xml:space="preserve">3.2.1 Taxa de desocupação</w:t>
       </w:r>
     </w:p>
     <w:p>
@@ -662,57 +271,42 @@
         <w:pStyle w:val="FirstParagraph"/>
       </w:pPr>
       <w:r>
-        <w:t xml:space="preserve">Esta dimensão responde à pergunta mais direta que se pode fazer sobre um</w:t>
+        <w:t xml:space="preserve">O Piauí registrou taxa de desocupação de 8,3%, ante</w:t>
       </w:r>
       <w:r>
         <w:t xml:space="preserve"> </w:t>
       </w:r>
       <w:r>
-        <w:t xml:space="preserve">mercado de trabalho: quem procura emprego está conseguindo encontrar? A taxa de</w:t>
+        <w:t xml:space="preserve">7,6% no Nordeste e 5,4%</w:t>
       </w:r>
       <w:r>
         <w:t xml:space="preserve"> </w:t>
       </w:r>
       <w:r>
-        <w:t xml:space="preserve">desocupação mede isso para a população em geral. Os dois indicadores auxiliares</w:t>
+        <w:t xml:space="preserve">no Brasil. Dentro do estado, a distância entre o estrato com maior e menor</w:t>
       </w:r>
       <w:r>
         <w:t xml:space="preserve"> </w:t>
       </w:r>
       <w:r>
-        <w:t xml:space="preserve">deslocam a pergunta para onde a resposta dói mais — o orçamento doméstico:</w:t>
+        <w:t xml:space="preserve">desocupação foi de 14,5 pontos percentuais, separando</w:t>
       </w:r>
       <w:r>
         <w:t xml:space="preserve"> </w:t>
       </w:r>
       <w:r>
-        <w:t xml:space="preserve">quando quem está sem trabalho é a pessoa responsável pelo domicílio, ou quem</w:t>
+        <w:t xml:space="preserve">estrato 2220020 (19,3%)</w:t>
       </w:r>
       <w:r>
         <w:t xml:space="preserve"> </w:t>
       </w:r>
       <w:r>
-        <w:t xml:space="preserve">divide com ela o sustento da casa, o desemprego deixa de ser um problema</w:t>
-      </w:r>
-      <w:r>
-        <w:t xml:space="preserve"> </w:t>
-      </w:r>
-      <w:r>
-        <w:t xml:space="preserve">individual e vira um problema familiar.</w:t>
-      </w:r>
-    </w:p>
-    <w:bookmarkStart w:id="31" w:name="taxa-de-desocupação"/>
-    <w:p>
-      <w:pPr>
-        <w:pStyle w:val="Heading4"/>
-      </w:pPr>
-      <w:r>
-        <w:t xml:space="preserve">3.2.1 Taxa de desocupação</w:t>
+        <w:t xml:space="preserve">de estrato 2210013 (4,8%).</w:t>
       </w:r>
     </w:p>
     <w:p>
       <w:pPr>
-        <w:pStyle w:val="FirstParagraph"/>
+        <w:pStyle w:val="BodyText"/>
       </w:pPr>
       <w:r>
         <w:rPr>
@@ -2363,18 +1957,18 @@
           <wp:inline>
             <wp:extent cx="5334000" cy="6267449"/>
             <wp:effectExtent b="0" l="0" r="0" t="0"/>
-            <wp:docPr descr="Taxa de desocupação por recorte geográfico" title="" id="29" name="Picture"/>
+            <wp:docPr descr="Taxa de desocupação por recorte geográfico" title="" id="28" name="Picture"/>
             <a:graphic>
               <a:graphicData uri="http://schemas.openxmlformats.org/drawingml/2006/picture">
                 <pic:pic>
                   <pic:nvPicPr>
-                    <pic:cNvPr descr="./output/figuras/comp_geo_Taxa_Desocupacao.png" id="30" name="Picture"/>
+                    <pic:cNvPr descr="./output/figuras/comp_geo_Taxa_Desocupacao.png" id="29" name="Picture"/>
                     <pic:cNvPicPr>
                       <a:picLocks noChangeArrowheads="1" noChangeAspect="1"/>
                     </pic:cNvPicPr>
                   </pic:nvPicPr>
                   <pic:blipFill>
-                    <a:blip r:embed="rId28"/>
+                    <a:blip r:embed="rId27"/>
                     <a:stretch>
                       <a:fillRect/>
                     </a:stretch>
@@ -2438,37 +2032,25 @@
         <w:pStyle w:val="BodyText"/>
       </w:pPr>
       <w:r>
-        <w:t xml:space="preserve">O Piauí registrou taxa de desocupação de 8,3%, ante</w:t>
+        <w:t xml:space="preserve">A diferença</w:t>
       </w:r>
       <w:r>
         <w:t xml:space="preserve"> </w:t>
       </w:r>
       <w:r>
-        <w:t xml:space="preserve">7,6% no Nordeste e 5,4%</w:t>
+        <w:t xml:space="preserve">entre Teresina e o restante do estado não alcançou significância estatística</w:t>
       </w:r>
       <w:r>
         <w:t xml:space="preserve"> </w:t>
       </w:r>
       <w:r>
-        <w:t xml:space="preserve">no Brasil. Dentro do estado, a distância entre o estrato com maior e menor</w:t>
+        <w:t xml:space="preserve">neste trimestre (p ajustado = 0,064), o</w:t>
       </w:r>
       <w:r>
         <w:t xml:space="preserve"> </w:t>
       </w:r>
       <w:r>
-        <w:t xml:space="preserve">desocupação foi de 14,5 pontos percentuais, separando</w:t>
-      </w:r>
-      <w:r>
-        <w:t xml:space="preserve"> </w:t>
-      </w:r>
-      <w:r>
-        <w:t xml:space="preserve">estrato 2220020 (19,3%)</w:t>
-      </w:r>
-      <w:r>
-        <w:t xml:space="preserve"> </w:t>
-      </w:r>
-      <w:r>
-        <w:t xml:space="preserve">de estrato 2210013 (4,8%).</w:t>
+        <w:t xml:space="preserve">que recomenda cautela antes de tratá-la como um padrão consolidado.</w:t>
       </w:r>
     </w:p>
     <w:p>
@@ -2476,25 +2058,88 @@
         <w:pStyle w:val="BodyText"/>
       </w:pPr>
       <w:r>
-        <w:t xml:space="preserve">A diferença</w:t>
+        <w:t xml:space="preserve">A comparação entre zona urbana e rural merece atenção específica, porque a</w:t>
       </w:r>
       <w:r>
         <w:t xml:space="preserve"> </w:t>
       </w:r>
       <w:r>
-        <w:t xml:space="preserve">entre Teresina e o restante do estado não alcançou significância estatística</w:t>
+        <w:t xml:space="preserve">desocupação rural costuma ser estruturalmente mais baixa: parte da população ocupada na agricultura familiar não procura, e muitas vezes se ocupam mais com produção por subsistência (verificar esse mecanismo)</w:t>
       </w:r>
       <w:r>
         <w:t xml:space="preserve"> </w:t>
       </w:r>
       <w:r>
-        <w:t xml:space="preserve">neste trimestre (p ajustado = 0,064), o</w:t>
+        <w:t xml:space="preserve">trabalho no sentido que a pesquisa capta, e por isso não é contada como</w:t>
       </w:r>
       <w:r>
         <w:t xml:space="preserve"> </w:t>
       </w:r>
       <w:r>
-        <w:t xml:space="preserve">que recomenda cautela antes de tratá-la como um padrão consolidado.</w:t>
+        <w:t xml:space="preserve">desocupada. Neste trimestre a diferença foi de 3,4</w:t>
+      </w:r>
+      <w:r>
+        <w:t xml:space="preserve"> </w:t>
+      </w:r>
+      <w:r>
+        <w:t xml:space="preserve">pontos (*).</w:t>
+      </w:r>
+    </w:p>
+    <w:p>
+      <w:pPr>
+        <w:pStyle w:val="BlockText"/>
+      </w:pPr>
+      <w:r>
+        <w:rPr>
+          <w:bCs/>
+          <w:b/>
+        </w:rPr>
+        <w:t xml:space="preserve">A REDIGIR</w:t>
+      </w:r>
+      <w:r>
+        <w:t xml:space="preserve"> </w:t>
+      </w:r>
+      <w:r>
+        <w:t xml:space="preserve">— bloco demográfico da desocupação — incluir só se o recorte for significativo E o CV ficar abaixo de 15% em TODAS as subdivisões de cada corte geográfico (ver anexo §5.3). Consultar output/tabelas/comparacao_demografica_</w:t>
+      </w:r>
+      <w:r>
+        <w:t xml:space="preserve">.csv.</w:t>
+      </w:r>
+    </w:p>
+    <w:bookmarkEnd w:id="30"/>
+    <w:bookmarkStart w:id="34" w:name="Xd1b2ad90a202d83d698be391e20f76697e1fb6b"/>
+    <w:p>
+      <w:pPr>
+        <w:pStyle w:val="Heading4"/>
+      </w:pPr>
+      <w:r>
+        <w:t xml:space="preserve">3.2.2 Desocupação da pessoa responsável pelo domicílio</w:t>
+      </w:r>
+    </w:p>
+    <w:p>
+      <w:pPr>
+        <w:pStyle w:val="FirstParagraph"/>
+      </w:pPr>
+      <w:r>
+        <w:t xml:space="preserve">Este indicador mede quanto dos desocupados são pessoas responsáveis pelo</w:t>
+      </w:r>
+      <w:r>
+        <w:t xml:space="preserve"> </w:t>
+      </w:r>
+      <w:r>
+        <w:t xml:space="preserve">domicílio. Uma taxa de desocupação alta concentrada em jovens que moram com os</w:t>
+      </w:r>
+      <w:r>
+        <w:t xml:space="preserve"> </w:t>
+      </w:r>
+      <w:r>
+        <w:t xml:space="preserve">pais tem um significado social muito diferente da mesma taxa concentrada em</w:t>
+      </w:r>
+      <w:r>
+        <w:t xml:space="preserve"> </w:t>
+      </w:r>
+      <w:r>
+        <w:t xml:space="preserve">quem sustenta a casa.</w:t>
       </w:r>
     </w:p>
     <w:p>
@@ -2502,94 +2147,25 @@
         <w:pStyle w:val="BodyText"/>
       </w:pPr>
       <w:r>
-        <w:t xml:space="preserve">A comparação entre zona urbana e rural merece atenção específica, porque a</w:t>
+        <w:t xml:space="preserve">Em estrato 2251012,</w:t>
       </w:r>
       <w:r>
         <w:t xml:space="preserve"> </w:t>
       </w:r>
       <w:r>
-        <w:t xml:space="preserve">desocupação rural costuma ser estruturalmente mais baixa por um motivo que não</w:t>
+        <w:t xml:space="preserve">58,6% dos desocupados eram</w:t>
       </w:r>
       <w:r>
         <w:t xml:space="preserve"> </w:t>
       </w:r>
       <w:r>
-        <w:t xml:space="preserve">é positivo: parte da população ocupada na agricultura familiar não procura</w:t>
+        <w:t xml:space="preserve">responsáveis pelo domicílio, contra 26,1%</w:t>
       </w:r>
       <w:r>
         <w:t xml:space="preserve"> </w:t>
       </w:r>
       <w:r>
-        <w:t xml:space="preserve">trabalho no sentido que a pesquisa capta, e por isso não é contada como</w:t>
-      </w:r>
-      <w:r>
-        <w:t xml:space="preserve"> </w:t>
-      </w:r>
-      <w:r>
-        <w:t xml:space="preserve">desocupada. Neste trimestre a diferença foi de 3,4</w:t>
-      </w:r>
-      <w:r>
-        <w:t xml:space="preserve"> </w:t>
-      </w:r>
-      <w:r>
-        <w:t xml:space="preserve">pontos (*).</w:t>
-      </w:r>
-    </w:p>
-    <w:p>
-      <w:pPr>
-        <w:pStyle w:val="BlockText"/>
-      </w:pPr>
-      <w:r>
-        <w:rPr>
-          <w:bCs/>
-          <w:b/>
-        </w:rPr>
-        <w:t xml:space="preserve">A REDIGIR</w:t>
-      </w:r>
-      <w:r>
-        <w:t xml:space="preserve"> </w:t>
-      </w:r>
-      <w:r>
-        <w:t xml:space="preserve">— bloco demográfico da desocupação — incluir só se o recorte for significativo E o CV ficar abaixo de 15% em TODAS as subdivisões de cada corte geográfico (ver anexo §5.3). Consultar output/tabelas/comparacao_demografica_</w:t>
-      </w:r>
-      <w:r>
-        <w:t xml:space="preserve">.csv.</w:t>
-      </w:r>
-    </w:p>
-    <w:bookmarkEnd w:id="31"/>
-    <w:bookmarkStart w:id="35" w:name="Xd1b2ad90a202d83d698be391e20f76697e1fb6b"/>
-    <w:p>
-      <w:pPr>
-        <w:pStyle w:val="Heading4"/>
-      </w:pPr>
-      <w:r>
-        <w:t xml:space="preserve">3.2.2 Desocupação da pessoa responsável pelo domicílio</w:t>
-      </w:r>
-    </w:p>
-    <w:p>
-      <w:pPr>
-        <w:pStyle w:val="FirstParagraph"/>
-      </w:pPr>
-      <w:r>
-        <w:t xml:space="preserve">Este indicador mede quanto dos desocupados são pessoas responsáveis pelo</w:t>
-      </w:r>
-      <w:r>
-        <w:t xml:space="preserve"> </w:t>
-      </w:r>
-      <w:r>
-        <w:t xml:space="preserve">domicílio. Uma taxa de desocupação alta concentrada em jovens que moram com os</w:t>
-      </w:r>
-      <w:r>
-        <w:t xml:space="preserve"> </w:t>
-      </w:r>
-      <w:r>
-        <w:t xml:space="preserve">pais tem um significado social muito diferente da mesma taxa concentrada em</w:t>
-      </w:r>
-      <w:r>
-        <w:t xml:space="preserve"> </w:t>
-      </w:r>
-      <w:r>
-        <w:t xml:space="preserve">quem sustenta a casa — e é essa distinção que o indicador captura.</w:t>
+        <w:t xml:space="preserve">em estrato 2210030.</w:t>
       </w:r>
     </w:p>
     <w:p>
@@ -4239,18 +3815,18 @@
           <wp:inline>
             <wp:extent cx="5334000" cy="6267449"/>
             <wp:effectExtent b="0" l="0" r="0" t="0"/>
-            <wp:docPr descr="Responsáveis pelo domicílio entre os desocupados" title="" id="33" name="Picture"/>
+            <wp:docPr descr="Responsáveis pelo domicílio entre os desocupados" title="" id="32" name="Picture"/>
             <a:graphic>
               <a:graphicData uri="http://schemas.openxmlformats.org/drawingml/2006/picture">
                 <pic:pic>
                   <pic:nvPicPr>
-                    <pic:cNvPr descr="./output/figuras/comp_geo_Chefes_Familia_Desocupados.png" id="34" name="Picture"/>
+                    <pic:cNvPr descr="./output/figuras/comp_geo_Chefes_Familia_Desocupados.png" id="33" name="Picture"/>
                     <pic:cNvPicPr>
                       <a:picLocks noChangeArrowheads="1" noChangeAspect="1"/>
                     </pic:cNvPicPr>
                   </pic:nvPicPr>
                   <pic:blipFill>
-                    <a:blip r:embed="rId32"/>
+                    <a:blip r:embed="rId31"/>
                     <a:stretch>
                       <a:fillRect/>
                     </a:stretch>
@@ -4311,32 +3887,6 @@
     </w:p>
     <w:p>
       <w:pPr>
-        <w:pStyle w:val="BodyText"/>
-      </w:pPr>
-      <w:r>
-        <w:t xml:space="preserve">Em estrato 2251012,</w:t>
-      </w:r>
-      <w:r>
-        <w:t xml:space="preserve"> </w:t>
-      </w:r>
-      <w:r>
-        <w:t xml:space="preserve">58,6% dos desocupados eram</w:t>
-      </w:r>
-      <w:r>
-        <w:t xml:space="preserve"> </w:t>
-      </w:r>
-      <w:r>
-        <w:t xml:space="preserve">responsáveis pelo domicílio, contra 26,1%</w:t>
-      </w:r>
-      <w:r>
-        <w:t xml:space="preserve"> </w:t>
-      </w:r>
-      <w:r>
-        <w:t xml:space="preserve">em estrato 2210030.</w:t>
-      </w:r>
-    </w:p>
-    <w:p>
-      <w:pPr>
         <w:pStyle w:val="BlockText"/>
       </w:pPr>
       <w:r>
@@ -4353,8 +3903,8 @@
         <w:t xml:space="preserve">— uma ou duas frases interpretando o contraste acima — o que significa, para o orçamento das famílias daquele estrato, essa concentração.</w:t>
       </w:r>
     </w:p>
-    <w:bookmarkEnd w:id="35"/>
-    <w:bookmarkStart w:id="39" w:name="Xc76167837fba252ecd20b236dca1fc167620c72"/>
+    <w:bookmarkEnd w:id="34"/>
+    <w:bookmarkStart w:id="38" w:name="Xc76167837fba252ecd20b236dca1fc167620c72"/>
     <w:p>
       <w:pPr>
         <w:pStyle w:val="Heading4"/>
@@ -4381,6 +3931,32 @@
       </w:r>
       <w:r>
         <w:t xml:space="preserve">adultos de quem a renda da casa depende diretamente.</w:t>
+      </w:r>
+    </w:p>
+    <w:p>
+      <w:pPr>
+        <w:pStyle w:val="BodyText"/>
+      </w:pPr>
+      <w:r>
+        <w:t xml:space="preserve">No Piauí, 55,6% dos desocupados eram</w:t>
+      </w:r>
+      <w:r>
+        <w:t xml:space="preserve"> </w:t>
+      </w:r>
+      <w:r>
+        <w:t xml:space="preserve">responsáveis pelo domicílio ou cônjuges, contra</w:t>
+      </w:r>
+      <w:r>
+        <w:t xml:space="preserve"> </w:t>
+      </w:r>
+      <w:r>
+        <w:t xml:space="preserve">37,9% apenas de responsáveis — a diferença</w:t>
+      </w:r>
+      <w:r>
+        <w:t xml:space="preserve"> </w:t>
+      </w:r>
+      <w:r>
+        <w:t xml:space="preserve">corresponde aos cônjuges desocupados.</w:t>
       </w:r>
     </w:p>
     <w:p>
@@ -6030,18 +5606,18 @@
           <wp:inline>
             <wp:extent cx="5334000" cy="6267449"/>
             <wp:effectExtent b="0" l="0" r="0" t="0"/>
-            <wp:docPr descr="Responsáveis ou cônjuges entre os desocupados" title="" id="37" name="Picture"/>
+            <wp:docPr descr="Responsáveis ou cônjuges entre os desocupados" title="" id="36" name="Picture"/>
             <a:graphic>
               <a:graphicData uri="http://schemas.openxmlformats.org/drawingml/2006/picture">
                 <pic:pic>
                   <pic:nvPicPr>
-                    <pic:cNvPr descr="./output/figuras/comp_geo_Conribuintes_Desocupados.png" id="38" name="Picture"/>
+                    <pic:cNvPr descr="./output/figuras/comp_geo_Conribuintes_Desocupados.png" id="37" name="Picture"/>
                     <pic:cNvPicPr>
                       <a:picLocks noChangeArrowheads="1" noChangeAspect="1"/>
                     </pic:cNvPicPr>
                   </pic:nvPicPr>
                   <pic:blipFill>
-                    <a:blip r:embed="rId36"/>
+                    <a:blip r:embed="rId35"/>
                     <a:stretch>
                       <a:fillRect/>
                     </a:stretch>
@@ -6096,32 +5672,6 @@
     </w:p>
     <w:p>
       <w:pPr>
-        <w:pStyle w:val="BodyText"/>
-      </w:pPr>
-      <w:r>
-        <w:t xml:space="preserve">No Piauí, 55,6% dos desocupados eram</w:t>
-      </w:r>
-      <w:r>
-        <w:t xml:space="preserve"> </w:t>
-      </w:r>
-      <w:r>
-        <w:t xml:space="preserve">responsáveis pelo domicílio ou cônjuges, contra</w:t>
-      </w:r>
-      <w:r>
-        <w:t xml:space="preserve"> </w:t>
-      </w:r>
-      <w:r>
-        <w:t xml:space="preserve">37,9% apenas de responsáveis — a diferença</w:t>
-      </w:r>
-      <w:r>
-        <w:t xml:space="preserve"> </w:t>
-      </w:r>
-      <w:r>
-        <w:t xml:space="preserve">corresponde aos cônjuges desocupados.</w:t>
-      </w:r>
-    </w:p>
-    <w:p>
-      <w:pPr>
         <w:pStyle w:val="BlockText"/>
       </w:pPr>
       <w:r>
@@ -6138,22 +5688,24 @@
         <w:t xml:space="preserve">— o que essa diferença diz sobre o arranjo de sustento das famílias do estado.</w:t>
       </w:r>
     </w:p>
-    <w:p>
-      <w:r>
-        <w:pict>
-          <v:rect style="width:0;height:1.5pt" o:hralign="center" o:hrstd="t" o:hr="t"/>
-        </w:pict>
-      </w:r>
-    </w:p>
+    <w:bookmarkEnd w:id="38"/>
     <w:bookmarkEnd w:id="39"/>
-    <w:bookmarkEnd w:id="40"/>
-    <w:bookmarkStart w:id="56" w:name="rendimento"/>
+    <w:bookmarkStart w:id="55" w:name="rendimento"/>
     <w:p>
       <w:pPr>
         <w:pStyle w:val="Heading3"/>
       </w:pPr>
       <w:r>
         <w:t xml:space="preserve">3.3 Rendimento</w:t>
+      </w:r>
+    </w:p>
+    <w:bookmarkStart w:id="43" w:name="rendimento-médio-real-habitual"/>
+    <w:p>
+      <w:pPr>
+        <w:pStyle w:val="Heading4"/>
+      </w:pPr>
+      <w:r>
+        <w:t xml:space="preserve">3.3.1 Rendimento médio real habitual</w:t>
       </w:r>
     </w:p>
     <w:p>
@@ -6161,51 +5713,30 @@
         <w:pStyle w:val="FirstParagraph"/>
       </w:pPr>
       <w:r>
-        <w:t xml:space="preserve">Se a dimensão anterior pergunta quem tem trabalho, esta pergunta quanto esse</w:t>
+        <w:t xml:space="preserve">No Piauí, 55,6% dos desocupados eram</w:t>
       </w:r>
       <w:r>
         <w:t xml:space="preserve"> </w:t>
       </w:r>
       <w:r>
-        <w:t xml:space="preserve">trabalho paga. O rendimento médio habitual é o indicador principal: mede o que</w:t>
+        <w:t xml:space="preserve">responsáveis pelo domicílio ou cônjuges, contra</w:t>
       </w:r>
       <w:r>
         <w:t xml:space="preserve"> </w:t>
       </w:r>
       <w:r>
-        <w:t xml:space="preserve">a pessoa recebe de forma regular, e não o que recebeu excepcionalmente naquele</w:t>
+        <w:t xml:space="preserve">37,9% apenas de responsáveis — a diferença</w:t>
       </w:r>
       <w:r>
         <w:t xml:space="preserve"> </w:t>
       </w:r>
       <w:r>
-        <w:t xml:space="preserve">mês, o que o torna mais adequado para comparar territórios. Os auxiliares</w:t>
-      </w:r>
-      <w:r>
-        <w:t xml:space="preserve"> </w:t>
-      </w:r>
-      <w:r>
-        <w:t xml:space="preserve">tratam do piso e da dispersão: quantos ganham abaixo do mínimo por hora, e</w:t>
-      </w:r>
-      <w:r>
-        <w:t xml:space="preserve"> </w:t>
-      </w:r>
-      <w:r>
-        <w:t xml:space="preserve">quanto a formalidade separa os rendimentos.</w:t>
-      </w:r>
-    </w:p>
-    <w:bookmarkStart w:id="44" w:name="rendimento-médio-real-habitual"/>
-    <w:p>
-      <w:pPr>
-        <w:pStyle w:val="Heading4"/>
-      </w:pPr>
-      <w:r>
-        <w:t xml:space="preserve">3.3.1 Rendimento médio real habitual</w:t>
+        <w:t xml:space="preserve">corresponde aos cônjuges desocupados.</w:t>
       </w:r>
     </w:p>
     <w:p>
       <w:pPr>
-        <w:pStyle w:val="FirstParagraph"/>
+        <w:pStyle w:val="BodyText"/>
       </w:pPr>
       <w:r>
         <w:rPr>
@@ -6691,18 +6222,18 @@
           <wp:inline>
             <wp:extent cx="5334000" cy="6267449"/>
             <wp:effectExtent b="0" l="0" r="0" t="0"/>
-            <wp:docPr descr="Rendimento médio habitual por recorte geográfico" title="" id="42" name="Picture"/>
+            <wp:docPr descr="Rendimento médio habitual por recorte geográfico" title="" id="41" name="Picture"/>
             <a:graphic>
               <a:graphicData uri="http://schemas.openxmlformats.org/drawingml/2006/picture">
                 <pic:pic>
                   <pic:nvPicPr>
-                    <pic:cNvPr descr="./output/figuras/comp_geo_Rendimento_Medio_Habitual.png" id="43" name="Picture"/>
+                    <pic:cNvPr descr="./output/figuras/comp_geo_Rendimento_Medio_Habitual.png" id="42" name="Picture"/>
                     <pic:cNvPicPr>
                       <a:picLocks noChangeArrowheads="1" noChangeAspect="1"/>
                     </pic:cNvPicPr>
                   </pic:nvPicPr>
                   <pic:blipFill>
-                    <a:blip r:embed="rId41"/>
+                    <a:blip r:embed="rId40"/>
                     <a:stretch>
                       <a:fillRect/>
                     </a:stretch>
@@ -6766,57 +6297,7 @@
         <w:pStyle w:val="BodyText"/>
       </w:pPr>
       <w:r>
-        <w:t xml:space="preserve">O rendimento médio no Piauí foi de R$ 2.547,</w:t>
-      </w:r>
-      <w:r>
-        <w:t xml:space="preserve"> </w:t>
-      </w:r>
-      <w:r>
-        <w:t xml:space="preserve">equivalente a 68,1% da média</w:t>
-      </w:r>
-      <w:r>
-        <w:t xml:space="preserve"> </w:t>
-      </w:r>
-      <w:r>
-        <w:t xml:space="preserve">nacional. Dentro do estado, estrato 2210013</w:t>
-      </w:r>
-      <w:r>
-        <w:t xml:space="preserve"> </w:t>
-      </w:r>
-      <w:r>
-        <w:t xml:space="preserve">apresentou o maior rendimento médio (R$ 6.034)</w:t>
-      </w:r>
-      <w:r>
-        <w:t xml:space="preserve"> </w:t>
-      </w:r>
-      <w:r>
-        <w:t xml:space="preserve">e estrato 2252020 o menor</w:t>
-      </w:r>
-      <w:r>
-        <w:t xml:space="preserve"> </w:t>
-      </w:r>
-      <w:r>
-        <w:t xml:space="preserve">(R$ 1.113) — uma razão de</w:t>
-      </w:r>
-      <w:r>
-        <w:t xml:space="preserve"> </w:t>
-      </w:r>
-      <w:r>
-        <w:t xml:space="preserve">5,42 entre os extremos.</w:t>
-      </w:r>
-    </w:p>
-    <w:p>
-      <w:pPr>
-        <w:pStyle w:val="BodyText"/>
-      </w:pPr>
-      <w:r>
-        <w:t xml:space="preserve">Vale registrar o que uma média de rendimento não mostra: ela é sensível a</w:t>
-      </w:r>
-      <w:r>
-        <w:t xml:space="preserve"> </w:t>
-      </w:r>
-      <w:r>
-        <w:t xml:space="preserve">valores muito altos e, em territórios pequenos, um punhado de rendimentos</w:t>
+        <w:t xml:space="preserve">Ressalta-se que a média de rendimento é sensível a valores muito altos e, em territórios pequenos, um punhado de rendimentos</w:t>
       </w:r>
       <w:r>
         <w:t xml:space="preserve"> </w:t>
@@ -6855,8 +6336,8 @@
         <w:t xml:space="preserve">— bloco demográfico do rendimento médio — incluir só se significativo E com CV abaixo de 15% em todas as subdivisões de cada corte geográfico.</w:t>
       </w:r>
     </w:p>
-    <w:bookmarkEnd w:id="44"/>
-    <w:bookmarkStart w:id="48" w:name="sub-remuneração"/>
+    <w:bookmarkEnd w:id="43"/>
+    <w:bookmarkStart w:id="47" w:name="sub-remuneração"/>
     <w:p>
       <w:pPr>
         <w:pStyle w:val="Heading4"/>
@@ -6882,13 +6363,37 @@
         <w:t xml:space="preserve"> </w:t>
       </w:r>
       <w:r>
-        <w:t xml:space="preserve">É um indicador de precariedade que a taxa de desocupação não alcança: trata-se</w:t>
+        <w:t xml:space="preserve">38,2% dos ocupados do Piauí recebiam abaixo</w:t>
       </w:r>
       <w:r>
         <w:t xml:space="preserve"> </w:t>
       </w:r>
       <w:r>
-        <w:t xml:space="preserve">de gente trabalhando, e trabalhando por menos do que o piso legal equivalente.</w:t>
+        <w:t xml:space="preserve">do mínimo por hora. A incidência foi de</w:t>
+      </w:r>
+      <w:r>
+        <w:t xml:space="preserve"> </w:t>
+      </w:r>
+      <w:r>
+        <w:t xml:space="preserve">67,4% em</w:t>
+      </w:r>
+      <w:r>
+        <w:t xml:space="preserve"> </w:t>
+      </w:r>
+      <w:r>
+        <w:t xml:space="preserve">estrato 2252021 e</w:t>
+      </w:r>
+      <w:r>
+        <w:t xml:space="preserve"> </w:t>
+      </w:r>
+      <w:r>
+        <w:t xml:space="preserve">17,7% em</w:t>
+      </w:r>
+      <w:r>
+        <w:t xml:space="preserve"> </w:t>
+      </w:r>
+      <w:r>
+        <w:t xml:space="preserve">estrato 2210012.</w:t>
       </w:r>
     </w:p>
     <w:p>
@@ -8538,18 +8043,18 @@
           <wp:inline>
             <wp:extent cx="5334000" cy="6267449"/>
             <wp:effectExtent b="0" l="0" r="0" t="0"/>
-            <wp:docPr descr="Sub-remuneração por recorte geográfico" title="" id="46" name="Picture"/>
+            <wp:docPr descr="Sub-remuneração por recorte geográfico" title="" id="45" name="Picture"/>
             <a:graphic>
               <a:graphicData uri="http://schemas.openxmlformats.org/drawingml/2006/picture">
                 <pic:pic>
                   <pic:nvPicPr>
-                    <pic:cNvPr descr="./output/figuras/comp_geo_Percentual_Subremuneracao.png" id="47" name="Picture"/>
+                    <pic:cNvPr descr="./output/figuras/comp_geo_Percentual_Subremuneracao.png" id="46" name="Picture"/>
                     <pic:cNvPicPr>
                       <a:picLocks noChangeArrowheads="1" noChangeAspect="1"/>
                     </pic:cNvPicPr>
                   </pic:nvPicPr>
                   <pic:blipFill>
-                    <a:blip r:embed="rId45"/>
+                    <a:blip r:embed="rId44"/>
                     <a:stretch>
                       <a:fillRect/>
                     </a:stretch>
@@ -8610,44 +8115,6 @@
     </w:p>
     <w:p>
       <w:pPr>
-        <w:pStyle w:val="BodyText"/>
-      </w:pPr>
-      <w:r>
-        <w:t xml:space="preserve">38,2% dos ocupados do Piauí recebiam abaixo</w:t>
-      </w:r>
-      <w:r>
-        <w:t xml:space="preserve"> </w:t>
-      </w:r>
-      <w:r>
-        <w:t xml:space="preserve">do mínimo por hora. A incidência foi de</w:t>
-      </w:r>
-      <w:r>
-        <w:t xml:space="preserve"> </w:t>
-      </w:r>
-      <w:r>
-        <w:t xml:space="preserve">67,4% em</w:t>
-      </w:r>
-      <w:r>
-        <w:t xml:space="preserve"> </w:t>
-      </w:r>
-      <w:r>
-        <w:t xml:space="preserve">estrato 2252021 e</w:t>
-      </w:r>
-      <w:r>
-        <w:t xml:space="preserve"> </w:t>
-      </w:r>
-      <w:r>
-        <w:t xml:space="preserve">17,7% em</w:t>
-      </w:r>
-      <w:r>
-        <w:t xml:space="preserve"> </w:t>
-      </w:r>
-      <w:r>
-        <w:t xml:space="preserve">estrato 2210012.</w:t>
-      </w:r>
-    </w:p>
-    <w:p>
-      <w:pPr>
         <w:pStyle w:val="BlockText"/>
       </w:pPr>
       <w:r>
@@ -8664,8 +8131,8 @@
         <w:t xml:space="preserve">— o que a distância entre esses dois extremos sugere sobre a estrutura produtiva dos territórios envolvidos.</w:t>
       </w:r>
     </w:p>
-    <w:bookmarkEnd w:id="48"/>
-    <w:bookmarkStart w:id="55" w:name="desigualdade-entre-formais-e-informais"/>
+    <w:bookmarkEnd w:id="47"/>
+    <w:bookmarkStart w:id="54" w:name="desigualdade-entre-formais-e-informais"/>
     <w:p>
       <w:pPr>
         <w:pStyle w:val="Heading4"/>
@@ -8691,13 +8158,37 @@
         <w:t xml:space="preserve"> </w:t>
       </w:r>
       <w:r>
-        <w:t xml:space="preserve">o dobro do informal. Quanto mais alta a razão, mais a carteira assinada — e não</w:t>
+        <w:t xml:space="preserve">o dobro do informal. A razão formal/informal no Piauí foi de 2,72 — ou seja,</w:t>
       </w:r>
       <w:r>
         <w:t xml:space="preserve"> </w:t>
       </w:r>
       <w:r>
-        <w:t xml:space="preserve">o esforço ou a jornada — determina quanto se ganha.</w:t>
+        <w:t xml:space="preserve">o trabalhador com carteira ganhou, em média, 172% a mais que o</w:t>
+      </w:r>
+      <w:r>
+        <w:t xml:space="preserve"> </w:t>
+      </w:r>
+      <w:r>
+        <w:t xml:space="preserve">informal: R$ 3.675 contra R$ 1.353.</w:t>
+      </w:r>
+      <w:r>
+        <w:t xml:space="preserve"> </w:t>
+      </w:r>
+      <w:r>
+        <w:t xml:space="preserve">Entre os estratos, a razão foi mais alta em estrato 2253020</w:t>
+      </w:r>
+      <w:r>
+        <w:t xml:space="preserve"> </w:t>
+      </w:r>
+      <w:r>
+        <w:t xml:space="preserve">(3,63) e mais baixa em estrato 2253022</w:t>
+      </w:r>
+      <w:r>
+        <w:t xml:space="preserve"> </w:t>
+      </w:r>
+      <w:r>
+        <w:t xml:space="preserve">(1,35).</w:t>
       </w:r>
     </w:p>
     <w:p>
@@ -10341,18 +9832,18 @@
           <wp:inline>
             <wp:extent cx="5334000" cy="6267449"/>
             <wp:effectExtent b="0" l="0" r="0" t="0"/>
-            <wp:docPr descr="Rendimento no setor formal" title="" id="50" name="Picture"/>
+            <wp:docPr descr="Rendimento no setor formal" title="" id="49" name="Picture"/>
             <a:graphic>
               <a:graphicData uri="http://schemas.openxmlformats.org/drawingml/2006/picture">
                 <pic:pic>
                   <pic:nvPicPr>
-                    <pic:cNvPr descr="./output/figuras/comp_geo_Rendimento_Formal.png" id="51" name="Picture"/>
+                    <pic:cNvPr descr="./output/figuras/comp_geo_Rendimento_Formal.png" id="50" name="Picture"/>
                     <pic:cNvPicPr>
                       <a:picLocks noChangeArrowheads="1" noChangeAspect="1"/>
                     </pic:cNvPicPr>
                   </pic:nvPicPr>
                   <pic:blipFill>
-                    <a:blip r:embed="rId49"/>
+                    <a:blip r:embed="rId48"/>
                     <a:stretch>
                       <a:fillRect/>
                     </a:stretch>
@@ -10414,18 +9905,18 @@
           <wp:inline>
             <wp:extent cx="5334000" cy="6267449"/>
             <wp:effectExtent b="0" l="0" r="0" t="0"/>
-            <wp:docPr descr="Rendimento no setor informal" title="" id="53" name="Picture"/>
+            <wp:docPr descr="Rendimento no setor informal" title="" id="52" name="Picture"/>
             <a:graphic>
               <a:graphicData uri="http://schemas.openxmlformats.org/drawingml/2006/picture">
                 <pic:pic>
                   <pic:nvPicPr>
-                    <pic:cNvPr descr="./output/figuras/comp_geo_Rendimento_Informal.png" id="54" name="Picture"/>
+                    <pic:cNvPr descr="./output/figuras/comp_geo_Rendimento_Informal.png" id="53" name="Picture"/>
                     <pic:cNvPicPr>
                       <a:picLocks noChangeArrowheads="1" noChangeAspect="1"/>
                     </pic:cNvPicPr>
                   </pic:nvPicPr>
                   <pic:blipFill>
-                    <a:blip r:embed="rId52"/>
+                    <a:blip r:embed="rId51"/>
                     <a:stretch>
                       <a:fillRect/>
                     </a:stretch>
@@ -10483,37 +9974,25 @@
         <w:pStyle w:val="BodyText"/>
       </w:pPr>
       <w:r>
-        <w:t xml:space="preserve">A razão formal/informal no Piauí foi de 2,72 — ou seja,</w:t>
+        <w:t xml:space="preserve">Vale contrastar com a capital: em Teresina a razão foi de</w:t>
       </w:r>
       <w:r>
         <w:t xml:space="preserve"> </w:t>
       </w:r>
       <w:r>
-        <w:t xml:space="preserve">o trabalhador com carteira ganhou, em média, 172% a mais que o</w:t>
+        <w:t xml:space="preserve">2,12, a mais baixa entre os recortes agregados — não</w:t>
       </w:r>
       <w:r>
         <w:t xml:space="preserve"> </w:t>
       </w:r>
       <w:r>
-        <w:t xml:space="preserve">informal: R$ 3.675 contra R$ 1.353.</w:t>
+        <w:t xml:space="preserve">porque o formal pague pouco ali, mas porque o informal teresinense ganha</w:t>
       </w:r>
       <w:r>
         <w:t xml:space="preserve"> </w:t>
       </w:r>
       <w:r>
-        <w:t xml:space="preserve">Entre os estratos, a razão foi mais alta em estrato 2253020</w:t>
-      </w:r>
-      <w:r>
-        <w:t xml:space="preserve"> </w:t>
-      </w:r>
-      <w:r>
-        <w:t xml:space="preserve">(3,63) e mais baixa em estrato 2253022</w:t>
-      </w:r>
-      <w:r>
-        <w:t xml:space="preserve"> </w:t>
-      </w:r>
-      <w:r>
-        <w:t xml:space="preserve">(1,35).</w:t>
+        <w:t xml:space="preserve">R$ 2.142, bem acima do informal do interior.</w:t>
       </w:r>
     </w:p>
     <w:p>
@@ -10521,32 +10000,6 @@
         <w:pStyle w:val="BodyText"/>
       </w:pPr>
       <w:r>
-        <w:t xml:space="preserve">Vale contrastar com a capital: em Teresina a razão foi de</w:t>
-      </w:r>
-      <w:r>
-        <w:t xml:space="preserve"> </w:t>
-      </w:r>
-      <w:r>
-        <w:t xml:space="preserve">2,12, a mais baixa entre os recortes agregados — não</w:t>
-      </w:r>
-      <w:r>
-        <w:t xml:space="preserve"> </w:t>
-      </w:r>
-      <w:r>
-        <w:t xml:space="preserve">porque o formal pague pouco ali, mas porque o informal teresinense ganha</w:t>
-      </w:r>
-      <w:r>
-        <w:t xml:space="preserve"> </w:t>
-      </w:r>
-      <w:r>
-        <w:t xml:space="preserve">R$ 2.142, bem acima do informal do interior.</w:t>
-      </w:r>
-    </w:p>
-    <w:p>
-      <w:pPr>
-        <w:pStyle w:val="BodyText"/>
-      </w:pPr>
-      <w:r>
         <w:t xml:space="preserve">Duas leituras opostas produzem o mesmo número baixo, e vale distingui-las. Uma</w:t>
       </w:r>
       <w:r>
@@ -10604,22 +10057,24 @@
         <w:t xml:space="preserve">— dizer qual dos dois casos se aplica aos estratos de razão mais baixa deste trimestre, olhando os rendimentos absolutos das Figuras 6 e 7.</w:t>
       </w:r>
     </w:p>
-    <w:p>
-      <w:r>
-        <w:pict>
-          <v:rect style="width:0;height:1.5pt" o:hralign="center" o:hrstd="t" o:hr="t"/>
-        </w:pict>
-      </w:r>
-    </w:p>
+    <w:bookmarkEnd w:id="54"/>
     <w:bookmarkEnd w:id="55"/>
-    <w:bookmarkEnd w:id="56"/>
-    <w:bookmarkStart w:id="69" w:name="inserção-no-mercado-de-trabalho"/>
+    <w:bookmarkStart w:id="68" w:name="inserção-no-mercado-de-trabalho"/>
     <w:p>
       <w:pPr>
         <w:pStyle w:val="Heading3"/>
       </w:pPr>
       <w:r>
         <w:t xml:space="preserve">3.4 Inserção no mercado de trabalho</w:t>
+      </w:r>
+    </w:p>
+    <w:bookmarkStart w:id="59" w:name="taxa-de-informalidade"/>
+    <w:p>
+      <w:pPr>
+        <w:pStyle w:val="Heading4"/>
+      </w:pPr>
+      <w:r>
+        <w:t xml:space="preserve">3.4.1 Taxa de informalidade</w:t>
       </w:r>
     </w:p>
     <w:p>
@@ -10627,45 +10082,54 @@
         <w:pStyle w:val="FirstParagraph"/>
       </w:pPr>
       <w:r>
-        <w:t xml:space="preserve">As duas dimensões anteriores tratam de ter trabalho e de quanto ele paga. Esta</w:t>
+        <w:t xml:space="preserve">A informalidade no Piauí atingiu 49,5% dos</w:t>
       </w:r>
       <w:r>
         <w:t xml:space="preserve"> </w:t>
       </w:r>
       <w:r>
-        <w:t xml:space="preserve">trata da qualidade do vínculo: com ou sem carteira, com jornada suficiente ou</w:t>
+        <w:t xml:space="preserve">ocupados, contra 48,7% no Nordeste e</w:t>
       </w:r>
       <w:r>
         <w:t xml:space="preserve"> </w:t>
       </w:r>
       <w:r>
-        <w:t xml:space="preserve">não, com qual escolaridade. São as condições que determinam acesso a</w:t>
+        <w:t xml:space="preserve">37,4% no Brasil. A variação interna ao estado foi</w:t>
       </w:r>
       <w:r>
         <w:t xml:space="preserve"> </w:t>
       </w:r>
       <w:r>
-        <w:t xml:space="preserve">previdência, seguro-desemprego, licenças e estabilidade — e que separam um</w:t>
+        <w:t xml:space="preserve">de 46,8 pontos, de</w:t>
       </w:r>
       <w:r>
         <w:t xml:space="preserve"> </w:t>
       </w:r>
       <w:r>
-        <w:t xml:space="preserve">mercado de trabalho que protege de um que apenas ocupa.</w:t>
-      </w:r>
-    </w:p>
-    <w:bookmarkStart w:id="60" w:name="taxa-de-informalidade"/>
-    <w:p>
-      <w:pPr>
-        <w:pStyle w:val="Heading4"/>
-      </w:pPr>
-      <w:r>
-        <w:t xml:space="preserve">3.4.1 Taxa de informalidade</w:t>
+        <w:t xml:space="preserve">30,3% em</w:t>
+      </w:r>
+      <w:r>
+        <w:t xml:space="preserve"> </w:t>
+      </w:r>
+      <w:r>
+        <w:t xml:space="preserve">estrato 2210012 a</w:t>
+      </w:r>
+      <w:r>
+        <w:t xml:space="preserve"> </w:t>
+      </w:r>
+      <w:r>
+        <w:t xml:space="preserve">77,1% em</w:t>
+      </w:r>
+      <w:r>
+        <w:t xml:space="preserve"> </w:t>
+      </w:r>
+      <w:r>
+        <w:t xml:space="preserve">estrato 2252021.</w:t>
       </w:r>
     </w:p>
     <w:p>
       <w:pPr>
-        <w:pStyle w:val="FirstParagraph"/>
+        <w:pStyle w:val="BodyText"/>
       </w:pPr>
       <w:r>
         <w:rPr>
@@ -12304,18 +11768,18 @@
           <wp:inline>
             <wp:extent cx="5334000" cy="6267449"/>
             <wp:effectExtent b="0" l="0" r="0" t="0"/>
-            <wp:docPr descr="Taxa de informalidade por recorte geográfico" title="" id="58" name="Picture"/>
+            <wp:docPr descr="Taxa de informalidade por recorte geográfico" title="" id="57" name="Picture"/>
             <a:graphic>
               <a:graphicData uri="http://schemas.openxmlformats.org/drawingml/2006/picture">
                 <pic:pic>
                   <pic:nvPicPr>
-                    <pic:cNvPr descr="./output/figuras/comp_geo_Taxa_Informalidade.png" id="59" name="Picture"/>
+                    <pic:cNvPr descr="./output/figuras/comp_geo_Taxa_Informalidade.png" id="58" name="Picture"/>
                     <pic:cNvPicPr>
                       <a:picLocks noChangeArrowheads="1" noChangeAspect="1"/>
                     </pic:cNvPicPr>
                   </pic:nvPicPr>
                   <pic:blipFill>
-                    <a:blip r:embed="rId57"/>
+                    <a:blip r:embed="rId56"/>
                     <a:stretch>
                       <a:fillRect/>
                     </a:stretch>
@@ -12373,56 +11837,6 @@
         <w:pStyle w:val="BodyText"/>
       </w:pPr>
       <w:r>
-        <w:t xml:space="preserve">A informalidade no Piauí atingiu 49,5% dos</w:t>
-      </w:r>
-      <w:r>
-        <w:t xml:space="preserve"> </w:t>
-      </w:r>
-      <w:r>
-        <w:t xml:space="preserve">ocupados, contra 48,7% no Nordeste e</w:t>
-      </w:r>
-      <w:r>
-        <w:t xml:space="preserve"> </w:t>
-      </w:r>
-      <w:r>
-        <w:t xml:space="preserve">37,4% no Brasil. A variação interna ao estado foi</w:t>
-      </w:r>
-      <w:r>
-        <w:t xml:space="preserve"> </w:t>
-      </w:r>
-      <w:r>
-        <w:t xml:space="preserve">de 46,8 pontos, de</w:t>
-      </w:r>
-      <w:r>
-        <w:t xml:space="preserve"> </w:t>
-      </w:r>
-      <w:r>
-        <w:t xml:space="preserve">30,3% em</w:t>
-      </w:r>
-      <w:r>
-        <w:t xml:space="preserve"> </w:t>
-      </w:r>
-      <w:r>
-        <w:t xml:space="preserve">estrato 2210012 a</w:t>
-      </w:r>
-      <w:r>
-        <w:t xml:space="preserve"> </w:t>
-      </w:r>
-      <w:r>
-        <w:t xml:space="preserve">77,1% em</w:t>
-      </w:r>
-      <w:r>
-        <w:t xml:space="preserve"> </w:t>
-      </w:r>
-      <w:r>
-        <w:t xml:space="preserve">estrato 2252021.</w:t>
-      </w:r>
-    </w:p>
-    <w:p>
-      <w:pPr>
-        <w:pStyle w:val="BodyText"/>
-      </w:pPr>
-      <w:r>
         <w:t xml:space="preserve">O contraste entre zona urbana e rural tende a ser o mais acentuado deste</w:t>
       </w:r>
       <w:r>
@@ -12474,8 +11888,8 @@
         <w:t xml:space="preserve">— bloco demográfico da informalidade — incluir só se significativo E com CV abaixo de 15% em todas as subdivisões de cada corte geográfico.</w:t>
       </w:r>
     </w:p>
-    <w:bookmarkEnd w:id="60"/>
-    <w:bookmarkStart w:id="64" w:name="sub-ocupação-por-insuficiência-de-horas"/>
+    <w:bookmarkEnd w:id="59"/>
+    <w:bookmarkStart w:id="63" w:name="sub-ocupação-por-insuficiência-de-horas"/>
     <w:p>
       <w:pPr>
         <w:pStyle w:val="Heading4"/>
@@ -12489,19 +11903,19 @@
         <w:pStyle w:val="FirstParagraph"/>
       </w:pPr>
       <w:r>
-        <w:t xml:space="preserve">Capta quem está trabalhando menos horas do que gostaria e poderia. É o</w:t>
+        <w:t xml:space="preserve">11,2% dos ocupados do Piauí estavam subocupados, com</w:t>
       </w:r>
       <w:r>
         <w:t xml:space="preserve"> </w:t>
       </w:r>
       <w:r>
-        <w:t xml:space="preserve">indicador que revela a ociosidade escondida dentro da ocupação: a pessoa é</w:t>
+        <w:t xml:space="preserve">27,5% em estrato 2251020</w:t>
       </w:r>
       <w:r>
         <w:t xml:space="preserve"> </w:t>
       </w:r>
       <w:r>
-        <w:t xml:space="preserve">contada como ocupada, mas sua capacidade de trabalho está sendo subutilizada.</w:t>
+        <w:t xml:space="preserve">e 7,8% em estrato 2253012.</w:t>
       </w:r>
     </w:p>
     <w:p>
@@ -14151,18 +13565,18 @@
           <wp:inline>
             <wp:extent cx="5334000" cy="6267449"/>
             <wp:effectExtent b="0" l="0" r="0" t="0"/>
-            <wp:docPr descr="Sub-ocupação por recorte geográfico" title="" id="62" name="Picture"/>
+            <wp:docPr descr="Sub-ocupação por recorte geográfico" title="" id="61" name="Picture"/>
             <a:graphic>
               <a:graphicData uri="http://schemas.openxmlformats.org/drawingml/2006/picture">
                 <pic:pic>
                   <pic:nvPicPr>
-                    <pic:cNvPr descr="./output/figuras/comp_geo_Taxa_Subocupacao.png" id="63" name="Picture"/>
+                    <pic:cNvPr descr="./output/figuras/comp_geo_Taxa_Subocupacao.png" id="62" name="Picture"/>
                     <pic:cNvPicPr>
                       <a:picLocks noChangeArrowheads="1" noChangeAspect="1"/>
                     </pic:cNvPicPr>
                   </pic:nvPicPr>
                   <pic:blipFill>
-                    <a:blip r:embed="rId61"/>
+                    <a:blip r:embed="rId60"/>
                     <a:stretch>
                       <a:fillRect/>
                     </a:stretch>
@@ -14223,26 +13637,6 @@
     </w:p>
     <w:p>
       <w:pPr>
-        <w:pStyle w:val="BodyText"/>
-      </w:pPr>
-      <w:r>
-        <w:t xml:space="preserve">11,2% dos ocupados do Piauí estavam subocupados, com</w:t>
-      </w:r>
-      <w:r>
-        <w:t xml:space="preserve"> </w:t>
-      </w:r>
-      <w:r>
-        <w:t xml:space="preserve">27,5% em estrato 2251020</w:t>
-      </w:r>
-      <w:r>
-        <w:t xml:space="preserve"> </w:t>
-      </w:r>
-      <w:r>
-        <w:t xml:space="preserve">e 7,8% em estrato 2253012.</w:t>
-      </w:r>
-    </w:p>
-    <w:p>
-      <w:pPr>
         <w:pStyle w:val="BlockText"/>
       </w:pPr>
       <w:r>
@@ -14259,8 +13653,8 @@
         <w:t xml:space="preserve">— relacionar a subocupação com a informalidade do mesmo território — jornada insuficiente e vínculo precário costumam andar juntos, mas nem sempre.</w:t>
       </w:r>
     </w:p>
-    <w:bookmarkEnd w:id="64"/>
-    <w:bookmarkStart w:id="68" w:name="escolaridade-dos-ocupados"/>
+    <w:bookmarkEnd w:id="63"/>
+    <w:bookmarkStart w:id="67" w:name="escolaridade-dos-ocupados"/>
     <w:p>
       <w:pPr>
         <w:pStyle w:val="Heading4"/>
@@ -14274,25 +13668,66 @@
         <w:pStyle w:val="FirstParagraph"/>
       </w:pPr>
       <w:r>
-        <w:t xml:space="preserve">Mede o percentual de ocupados com ensino médio completo ou mais. Funciona como</w:t>
+        <w:t xml:space="preserve">91,4% em</w:t>
       </w:r>
       <w:r>
         <w:t xml:space="preserve"> </w:t>
       </w:r>
       <w:r>
-        <w:t xml:space="preserve">aproximação da qualificação da mão de obra empregada e, indiretamente, do tipo</w:t>
+        <w:t xml:space="preserve">estrato 2210013 e</w:t>
       </w:r>
       <w:r>
         <w:t xml:space="preserve"> </w:t>
       </w:r>
       <w:r>
-        <w:t xml:space="preserve">de posto de trabalho que cada território oferece.</w:t>
-      </w:r>
-    </w:p>
-    <w:p>
-      <w:pPr>
-        <w:pStyle w:val="BodyText"/>
-      </w:pPr>
+        <w:t xml:space="preserve">32,2% em</w:t>
+      </w:r>
+      <w:r>
+        <w:t xml:space="preserve"> </w:t>
+      </w:r>
+      <w:r>
+        <w:t xml:space="preserve">estrato 2254020 — uma diferença de</w:t>
+      </w:r>
+      <w:r>
+        <w:t xml:space="preserve"> </w:t>
+      </w:r>
+      <w:r>
+        <w:t xml:space="preserve">59,2 pontos. Cabe uma cautela de leitura: este indicador mede a</w:t>
+      </w:r>
+      <w:r>
+        <w:t xml:space="preserve"> </w:t>
+      </w:r>
+      <w:r>
+        <w:t xml:space="preserve">escolaridade de quem</w:t>
+      </w:r>
+      <w:r>
+        <w:t xml:space="preserve"> </w:t>
+      </w:r>
+      <w:r>
+        <w:rPr>
+          <w:iCs/>
+          <w:i/>
+        </w:rPr>
+        <w:t xml:space="preserve">está ocupado</w:t>
+      </w:r>
+      <w:r>
+        <w:t xml:space="preserve">, não a da população. Um estrato pode</w:t>
+      </w:r>
+      <w:r>
+        <w:t xml:space="preserve"> </w:t>
+      </w:r>
+      <w:r>
+        <w:t xml:space="preserve">aparecer com escolaridade alta simplesmente porque os menos escolarizados não</w:t>
+      </w:r>
+      <w:r>
+        <w:t xml:space="preserve"> </w:t>
+      </w:r>
+      <w:r>
+        <w:t xml:space="preserve">encontraram trabalho, e não porque a população seja mais escolarizada.</w:t>
+      </w:r>
+      <w:r>
+        <w:t xml:space="preserve"> </w:t>
+      </w:r>
       <w:r>
         <w:rPr>
           <w:bCs/>
@@ -15936,18 +15371,18 @@
           <wp:inline>
             <wp:extent cx="5334000" cy="6267449"/>
             <wp:effectExtent b="0" l="0" r="0" t="0"/>
-            <wp:docPr descr="Ocupados com médio completo ou mais" title="" id="66" name="Picture"/>
+            <wp:docPr descr="Ocupados com médio completo ou mais" title="" id="65" name="Picture"/>
             <a:graphic>
               <a:graphicData uri="http://schemas.openxmlformats.org/drawingml/2006/picture">
                 <pic:pic>
                   <pic:nvPicPr>
-                    <pic:cNvPr descr="./output/figuras/comp_geo_Proporcao_Ocupados_Escolarizados.png" id="67" name="Picture"/>
+                    <pic:cNvPr descr="./output/figuras/comp_geo_Proporcao_Ocupados_Escolarizados.png" id="66" name="Picture"/>
                     <pic:cNvPicPr>
                       <a:picLocks noChangeArrowheads="1" noChangeAspect="1"/>
                     </pic:cNvPicPr>
                   </pic:nvPicPr>
                   <pic:blipFill>
-                    <a:blip r:embed="rId65"/>
+                    <a:blip r:embed="rId64"/>
                     <a:stretch>
                       <a:fillRect/>
                     </a:stretch>
@@ -16006,79 +15441,9 @@
         <w:t xml:space="preserve">2º trimestre de 2026</w:t>
       </w:r>
     </w:p>
-    <w:p>
-      <w:pPr>
-        <w:pStyle w:val="BodyText"/>
-      </w:pPr>
-      <w:r>
-        <w:t xml:space="preserve">91,4% em</w:t>
-      </w:r>
-      <w:r>
-        <w:t xml:space="preserve"> </w:t>
-      </w:r>
-      <w:r>
-        <w:t xml:space="preserve">estrato 2210013 e</w:t>
-      </w:r>
-      <w:r>
-        <w:t xml:space="preserve"> </w:t>
-      </w:r>
-      <w:r>
-        <w:t xml:space="preserve">32,2% em</w:t>
-      </w:r>
-      <w:r>
-        <w:t xml:space="preserve"> </w:t>
-      </w:r>
-      <w:r>
-        <w:t xml:space="preserve">estrato 2254020 — uma diferença de</w:t>
-      </w:r>
-      <w:r>
-        <w:t xml:space="preserve"> </w:t>
-      </w:r>
-      <w:r>
-        <w:t xml:space="preserve">59,2 pontos. Cabe uma cautela de leitura: este indicador mede a</w:t>
-      </w:r>
-      <w:r>
-        <w:t xml:space="preserve"> </w:t>
-      </w:r>
-      <w:r>
-        <w:t xml:space="preserve">escolaridade de quem</w:t>
-      </w:r>
-      <w:r>
-        <w:t xml:space="preserve"> </w:t>
-      </w:r>
-      <w:r>
-        <w:rPr>
-          <w:iCs/>
-          <w:i/>
-        </w:rPr>
-        <w:t xml:space="preserve">está ocupado</w:t>
-      </w:r>
-      <w:r>
-        <w:t xml:space="preserve">, não a da população. Um estrato pode</w:t>
-      </w:r>
-      <w:r>
-        <w:t xml:space="preserve"> </w:t>
-      </w:r>
-      <w:r>
-        <w:t xml:space="preserve">aparecer com escolaridade alta simplesmente porque os menos escolarizados não</w:t>
-      </w:r>
-      <w:r>
-        <w:t xml:space="preserve"> </w:t>
-      </w:r>
-      <w:r>
-        <w:t xml:space="preserve">encontraram trabalho, e não porque a população seja mais escolarizada.</w:t>
-      </w:r>
-    </w:p>
-    <w:p>
-      <w:r>
-        <w:pict>
-          <v:rect style="width:0;height:1.5pt" o:hralign="center" o:hrstd="t" o:hr="t"/>
-        </w:pict>
-      </w:r>
-    </w:p>
+    <w:bookmarkEnd w:id="67"/>
     <w:bookmarkEnd w:id="68"/>
-    <w:bookmarkEnd w:id="69"/>
-    <w:bookmarkStart w:id="91" w:name="desalento"/>
+    <w:bookmarkStart w:id="90" w:name="desalento"/>
     <w:p>
       <w:pPr>
         <w:pStyle w:val="Heading3"/>
@@ -16092,40 +15457,46 @@
         <w:pStyle w:val="FirstParagraph"/>
       </w:pPr>
       <w:r>
-        <w:t xml:space="preserve">O desalento é a face do desemprego que as estatísticas convencionais não</w:t>
+        <w:t xml:space="preserve">O desalento atingiu 7,0% da força de</w:t>
       </w:r>
       <w:r>
         <w:t xml:space="preserve"> </w:t>
       </w:r>
       <w:r>
-        <w:t xml:space="preserve">capturam. Uma pessoa desalentada gostaria de trabalhar, está disponível para</w:t>
+        <w:t xml:space="preserve">trabalho ampliada do Piauí, com 23,2%</w:t>
       </w:r>
       <w:r>
         <w:t xml:space="preserve"> </w:t>
       </w:r>
       <w:r>
-        <w:t xml:space="preserve">isso, mas deixou de procurar por acreditar que não encontraria vaga. Como não</w:t>
+        <w:t xml:space="preserve">em estrato 2251022 e</w:t>
       </w:r>
       <w:r>
         <w:t xml:space="preserve"> </w:t>
       </w:r>
       <w:r>
-        <w:t xml:space="preserve">procurou, não é contada como desocupada — sai da força de trabalho e some da</w:t>
+        <w:t xml:space="preserve">7,2% em</w:t>
       </w:r>
       <w:r>
         <w:t xml:space="preserve"> </w:t>
       </w:r>
       <w:r>
-        <w:t xml:space="preserve">taxa de desocupação. É por isso que um território pode ter desemprego em queda</w:t>
+        <w:t xml:space="preserve">estrato 2251011. Entre as pessoas fora da</w:t>
       </w:r>
       <w:r>
         <w:t xml:space="preserve"> </w:t>
       </w:r>
       <w:r>
-        <w:t xml:space="preserve">e mercado de trabalho piorando ao mesmo tempo.</w:t>
+        <w:t xml:space="preserve">força de trabalho, os desalentados foram</w:t>
+      </w:r>
+      <w:r>
+        <w:t xml:space="preserve"> </w:t>
+      </w:r>
+      <w:r>
+        <w:t xml:space="preserve">68,4% no estado.</w:t>
       </w:r>
     </w:p>
-    <w:bookmarkStart w:id="76" w:name="percentual-de-desalentados"/>
+    <w:bookmarkStart w:id="75" w:name="percentual-de-desalentados"/>
     <w:p>
       <w:pPr>
         <w:pStyle w:val="Heading4"/>
@@ -17781,18 +17152,18 @@
           <wp:inline>
             <wp:extent cx="5334000" cy="6267449"/>
             <wp:effectExtent b="0" l="0" r="0" t="0"/>
-            <wp:docPr descr="Desalentados na força ampliada" title="" id="71" name="Picture"/>
+            <wp:docPr descr="Desalentados na força ampliada" title="" id="70" name="Picture"/>
             <a:graphic>
               <a:graphicData uri="http://schemas.openxmlformats.org/drawingml/2006/picture">
                 <pic:pic>
                   <pic:nvPicPr>
-                    <pic:cNvPr descr="./output/figuras/comp_geo_Desalentados_Forca_Ampliada.png" id="72" name="Picture"/>
+                    <pic:cNvPr descr="./output/figuras/comp_geo_Desalentados_Forca_Ampliada.png" id="71" name="Picture"/>
                     <pic:cNvPicPr>
                       <a:picLocks noChangeArrowheads="1" noChangeAspect="1"/>
                     </pic:cNvPicPr>
                   </pic:nvPicPr>
                   <pic:blipFill>
-                    <a:blip r:embed="rId70"/>
+                    <a:blip r:embed="rId69"/>
                     <a:stretch>
                       <a:fillRect/>
                     </a:stretch>
@@ -17860,18 +17231,18 @@
           <wp:inline>
             <wp:extent cx="5334000" cy="6267449"/>
             <wp:effectExtent b="0" l="0" r="0" t="0"/>
-            <wp:docPr descr="Desalentados fora da força de trabalho" title="" id="74" name="Picture"/>
+            <wp:docPr descr="Desalentados fora da força de trabalho" title="" id="73" name="Picture"/>
             <a:graphic>
               <a:graphicData uri="http://schemas.openxmlformats.org/drawingml/2006/picture">
                 <pic:pic>
                   <pic:nvPicPr>
-                    <pic:cNvPr descr="./output/figuras/comp_geo_Desalentados_Fora_Forca.png" id="75" name="Picture"/>
+                    <pic:cNvPr descr="./output/figuras/comp_geo_Desalentados_Fora_Forca.png" id="74" name="Picture"/>
                     <pic:cNvPicPr>
                       <a:picLocks noChangeArrowheads="1" noChangeAspect="1"/>
                     </pic:cNvPicPr>
                   </pic:nvPicPr>
                   <pic:blipFill>
-                    <a:blip r:embed="rId73"/>
+                    <a:blip r:embed="rId72"/>
                     <a:stretch>
                       <a:fillRect/>
                     </a:stretch>
@@ -17935,50 +17306,6 @@
         <w:pStyle w:val="BodyText"/>
       </w:pPr>
       <w:r>
-        <w:t xml:space="preserve">O desalento atingiu 7,0% da força de</w:t>
-      </w:r>
-      <w:r>
-        <w:t xml:space="preserve"> </w:t>
-      </w:r>
-      <w:r>
-        <w:t xml:space="preserve">trabalho ampliada do Piauí, com 23,2%</w:t>
-      </w:r>
-      <w:r>
-        <w:t xml:space="preserve"> </w:t>
-      </w:r>
-      <w:r>
-        <w:t xml:space="preserve">em estrato 2251022 e</w:t>
-      </w:r>
-      <w:r>
-        <w:t xml:space="preserve"> </w:t>
-      </w:r>
-      <w:r>
-        <w:t xml:space="preserve">7,2% em</w:t>
-      </w:r>
-      <w:r>
-        <w:t xml:space="preserve"> </w:t>
-      </w:r>
-      <w:r>
-        <w:t xml:space="preserve">estrato 2251011. Entre as pessoas fora da</w:t>
-      </w:r>
-      <w:r>
-        <w:t xml:space="preserve"> </w:t>
-      </w:r>
-      <w:r>
-        <w:t xml:space="preserve">força de trabalho, os desalentados foram</w:t>
-      </w:r>
-      <w:r>
-        <w:t xml:space="preserve"> </w:t>
-      </w:r>
-      <w:r>
-        <w:t xml:space="preserve">68,4% no estado.</w:t>
-      </w:r>
-    </w:p>
-    <w:p>
-      <w:pPr>
-        <w:pStyle w:val="BodyText"/>
-      </w:pPr>
-      <w:r>
         <w:t xml:space="preserve">A leitura conjunta com a taxa de desocupação é o que dá sentido ao indicador.</w:t>
       </w:r>
     </w:p>
@@ -18000,8 +17327,8 @@
         <w:t xml:space="preserve">— comparar a lista de estratos com maior desalento com a de maior desocupação (Tabelas 2 e 11) e dizer se coincidem. Quando desalento alto convive com desocupação baixa, a taxa de desemprego daquele território está subestimando o problema.</w:t>
       </w:r>
     </w:p>
-    <w:bookmarkEnd w:id="76"/>
-    <w:bookmarkStart w:id="80" w:name="jovens-que-não-trabalham-nem-estudam"/>
+    <w:bookmarkEnd w:id="75"/>
+    <w:bookmarkStart w:id="79" w:name="jovens-que-não-trabalham-nem-estudam"/>
     <w:p>
       <w:pPr>
         <w:pStyle w:val="Heading4"/>
@@ -18013,6 +17340,32 @@
     <w:p>
       <w:pPr>
         <w:pStyle w:val="FirstParagraph"/>
+      </w:pPr>
+      <w:r>
+        <w:t xml:space="preserve">24,3% dos jovens piauienses de 14 a 29 anos não</w:t>
+      </w:r>
+      <w:r>
+        <w:t xml:space="preserve"> </w:t>
+      </w:r>
+      <w:r>
+        <w:t xml:space="preserve">trabalhavam nem estudavam. A incidência variou de</w:t>
+      </w:r>
+      <w:r>
+        <w:t xml:space="preserve"> </w:t>
+      </w:r>
+      <w:r>
+        <w:t xml:space="preserve">13,5% em estrato 2210012 a</w:t>
+      </w:r>
+      <w:r>
+        <w:t xml:space="preserve"> </w:t>
+      </w:r>
+      <w:r>
+        <w:t xml:space="preserve">49,8% em estrato 2251022.</w:t>
+      </w:r>
+    </w:p>
+    <w:p>
+      <w:pPr>
+        <w:pStyle w:val="BodyText"/>
       </w:pPr>
       <w:r>
         <w:rPr>
@@ -19657,18 +19010,18 @@
           <wp:inline>
             <wp:extent cx="5334000" cy="6267449"/>
             <wp:effectExtent b="0" l="0" r="0" t="0"/>
-            <wp:docPr descr="Taxa de jovens nem-nem" title="" id="78" name="Picture"/>
+            <wp:docPr descr="Taxa de jovens nem-nem" title="" id="77" name="Picture"/>
             <a:graphic>
               <a:graphicData uri="http://schemas.openxmlformats.org/drawingml/2006/picture">
                 <pic:pic>
                   <pic:nvPicPr>
-                    <pic:cNvPr descr="./output/figuras/comp_geo_Taxa_Nem_Nem.png" id="79" name="Picture"/>
+                    <pic:cNvPr descr="./output/figuras/comp_geo_Taxa_Nem_Nem.png" id="78" name="Picture"/>
                     <pic:cNvPicPr>
                       <a:picLocks noChangeArrowheads="1" noChangeAspect="1"/>
                     </pic:cNvPicPr>
                   </pic:nvPicPr>
                   <pic:blipFill>
-                    <a:blip r:embed="rId77"/>
+                    <a:blip r:embed="rId76"/>
                     <a:stretch>
                       <a:fillRect/>
                     </a:stretch>
@@ -19729,48 +19082,20 @@
     </w:p>
     <w:p>
       <w:pPr>
-        <w:pStyle w:val="BodyText"/>
+        <w:pStyle w:val="BlockText"/>
       </w:pPr>
       <w:r>
-        <w:t xml:space="preserve">24,3% dos jovens piauienses de 14 a 29 anos não</w:t>
+        <w:rPr>
+          <w:bCs/>
+          <w:b/>
+        </w:rPr>
+        <w:t xml:space="preserve">A REDIGIR</w:t>
       </w:r>
       <w:r>
         <w:t xml:space="preserve"> </w:t>
       </w:r>
       <w:r>
-        <w:t xml:space="preserve">trabalhavam nem estudavam. A incidência variou de</w:t>
-      </w:r>
-      <w:r>
-        <w:t xml:space="preserve"> </w:t>
-      </w:r>
-      <w:r>
-        <w:t xml:space="preserve">13,5% em estrato 2210012 a</w:t>
-      </w:r>
-      <w:r>
-        <w:t xml:space="preserve"> </w:t>
-      </w:r>
-      <w:r>
-        <w:t xml:space="preserve">49,8% em estrato 2251022.</w:t>
-      </w:r>
-    </w:p>
-    <w:p>
-      <w:pPr>
-        <w:pStyle w:val="BodyText"/>
-      </w:pPr>
-      <w:r>
-        <w:t xml:space="preserve">Este é o indicador com maior conteúdo prospectivo do relatório: ele não mede o</w:t>
-      </w:r>
-      <w:r>
-        <w:t xml:space="preserve"> </w:t>
-      </w:r>
-      <w:r>
-        <w:t xml:space="preserve">mercado de trabalho de hoje, mas a formação — ou a não formação — da força de</w:t>
-      </w:r>
-      <w:r>
-        <w:t xml:space="preserve"> </w:t>
-      </w:r>
-      <w:r>
-        <w:t xml:space="preserve">trabalho da próxima década.</w:t>
+        <w:t xml:space="preserve">— o que a amplitude entre os estratos extremos significa para a próxima década de oferta de trabalho no estado.</w:t>
       </w:r>
     </w:p>
     <w:p>
@@ -19788,29 +19113,11 @@
         <w:t xml:space="preserve"> </w:t>
       </w:r>
       <w:r>
-        <w:t xml:space="preserve">— o que a amplitude entre os estratos extremos significa para a próxima década de oferta de trabalho no estado.</w:t>
+        <w:t xml:space="preserve">— bloco demográfico dos nem-nem — é o recorte em que a diferença por sexo costuma ser mais acentuada, por conta do trabalho doméstico e de cuidado não remunerado. Incluir só se significativo E com CV abaixo de 15% em todas as subdivisões.</w:t>
       </w:r>
     </w:p>
-    <w:p>
-      <w:pPr>
-        <w:pStyle w:val="BlockText"/>
-      </w:pPr>
-      <w:r>
-        <w:rPr>
-          <w:bCs/>
-          <w:b/>
-        </w:rPr>
-        <w:t xml:space="preserve">A REDIGIR</w:t>
-      </w:r>
-      <w:r>
-        <w:t xml:space="preserve"> </w:t>
-      </w:r>
-      <w:r>
-        <w:t xml:space="preserve">— bloco demográfico dos nem-nem — é o recorte em que a diferença por sexo costuma ser mais acentuada, por conta do trabalho doméstico e de cuidado não remunerado. Incluir só se significativo E com CV abaixo de 15% em todas as subdivisões.</w:t>
-      </w:r>
-    </w:p>
-    <w:bookmarkEnd w:id="80"/>
-    <w:bookmarkStart w:id="90" w:name="motivos-para-não-procurar-trabalho"/>
+    <w:bookmarkEnd w:id="79"/>
+    <w:bookmarkStart w:id="89" w:name="motivos-para-não-procurar-trabalho"/>
     <w:p>
       <w:pPr>
         <w:pStyle w:val="Heading4"/>
@@ -19824,25 +19131,37 @@
         <w:pStyle w:val="FirstParagraph"/>
       </w:pPr>
       <w:r>
-        <w:t xml:space="preserve">Os indicadores anteriores dizem quantos desistiram. Este diz por quê — e é o</w:t>
+        <w:t xml:space="preserve">Estes são os indicadores mais frágeis do relatório em termos de precisão: são</w:t>
       </w:r>
       <w:r>
         <w:t xml:space="preserve"> </w:t>
       </w:r>
       <w:r>
-        <w:t xml:space="preserve">que separa um diagnóstico de falta de vagas de um diagnóstico de</w:t>
+        <w:t xml:space="preserve">proporções calculadas sobre um subconjunto já pequeno — os desalentados, ou os</w:t>
       </w:r>
       <w:r>
         <w:t xml:space="preserve"> </w:t>
       </w:r>
       <w:r>
-        <w:t xml:space="preserve">incompatibilidade entre a mão de obra disponível e as vagas existentes. Os dois</w:t>
+        <w:t xml:space="preserve">jovens nem-nem — e depois repartidas entre várias categorias de resposta. É</w:t>
       </w:r>
       <w:r>
         <w:t xml:space="preserve"> </w:t>
       </w:r>
       <w:r>
-        <w:t xml:space="preserve">pedem políticas públicas diferentes.</w:t>
+        <w:t xml:space="preserve">normal que a maioria das células apareça com CV alto nos estratos mais finos, e</w:t>
+      </w:r>
+      <w:r>
+        <w:t xml:space="preserve"> </w:t>
+      </w:r>
+      <w:r>
+        <w:t xml:space="preserve">elas devem ser lidas como indicativas, não conclusivas. Incluimos elas pois são importantissimos</w:t>
+      </w:r>
+      <w:r>
+        <w:t xml:space="preserve"> </w:t>
+      </w:r>
+      <w:r>
+        <w:t xml:space="preserve">para distinguir quem desistiu de procurar emprego por baixar perspectivas de emprego na região, por obrigações domésticas ou por apenas desinteresse.</w:t>
       </w:r>
     </w:p>
     <w:p>
@@ -19854,18 +19173,18 @@
           <wp:inline>
             <wp:extent cx="5334000" cy="6267449"/>
             <wp:effectExtent b="0" l="0" r="0" t="0"/>
-            <wp:docPr descr="Motivo da desistência entre os desalentados" title="" id="82" name="Picture"/>
+            <wp:docPr descr="Motivo da desistência entre os desalentados" title="" id="81" name="Picture"/>
             <a:graphic>
               <a:graphicData uri="http://schemas.openxmlformats.org/drawingml/2006/picture">
                 <pic:pic>
                   <pic:nvPicPr>
-                    <pic:cNvPr descr="./output/figuras/comp_geo_Motivo_Desistencia_Desalentado.png" id="83" name="Picture"/>
+                    <pic:cNvPr descr="./output/figuras/comp_geo_Motivo_Desistencia_Desalentado.png" id="82" name="Picture"/>
                     <pic:cNvPicPr>
                       <a:picLocks noChangeArrowheads="1" noChangeAspect="1"/>
                     </pic:cNvPicPr>
                   </pic:nvPicPr>
                   <pic:blipFill>
-                    <a:blip r:embed="rId81"/>
+                    <a:blip r:embed="rId80"/>
                     <a:stretch>
                       <a:fillRect/>
                     </a:stretch>
@@ -19933,18 +19252,18 @@
           <wp:inline>
             <wp:extent cx="5334000" cy="6267449"/>
             <wp:effectExtent b="0" l="0" r="0" t="0"/>
-            <wp:docPr descr="Motivo de não procurar trabalho entre os nem-nem" title="" id="85" name="Picture"/>
+            <wp:docPr descr="Motivo de não procurar trabalho entre os nem-nem" title="" id="84" name="Picture"/>
             <a:graphic>
               <a:graphicData uri="http://schemas.openxmlformats.org/drawingml/2006/picture">
                 <pic:pic>
                   <pic:nvPicPr>
-                    <pic:cNvPr descr="./output/figuras/comp_geo_Motivo_Nao_Procura_NemNem.png" id="86" name="Picture"/>
+                    <pic:cNvPr descr="./output/figuras/comp_geo_Motivo_Nao_Procura_NemNem.png" id="85" name="Picture"/>
                     <pic:cNvPicPr>
                       <a:picLocks noChangeArrowheads="1" noChangeAspect="1"/>
                     </pic:cNvPicPr>
                   </pic:nvPicPr>
                   <pic:blipFill>
-                    <a:blip r:embed="rId84"/>
+                    <a:blip r:embed="rId83"/>
                     <a:stretch>
                       <a:fillRect/>
                     </a:stretch>
@@ -20012,18 +19331,18 @@
           <wp:inline>
             <wp:extent cx="5334000" cy="6267449"/>
             <wp:effectExtent b="0" l="0" r="0" t="0"/>
-            <wp:docPr descr="Motivo de não iniciar trabalho entre os nem-nem" title="" id="88" name="Picture"/>
+            <wp:docPr descr="Motivo de não iniciar trabalho entre os nem-nem" title="" id="87" name="Picture"/>
             <a:graphic>
               <a:graphicData uri="http://schemas.openxmlformats.org/drawingml/2006/picture">
                 <pic:pic>
                   <pic:nvPicPr>
-                    <pic:cNvPr descr="./output/figuras/comp_geo_Motivo_Nao_Inicio_NemNem.png" id="89" name="Picture"/>
+                    <pic:cNvPr descr="./output/figuras/comp_geo_Motivo_Nao_Inicio_NemNem.png" id="88" name="Picture"/>
                     <pic:cNvPicPr>
                       <a:picLocks noChangeArrowheads="1" noChangeAspect="1"/>
                     </pic:cNvPicPr>
                   </pic:nvPicPr>
                   <pic:blipFill>
-                    <a:blip r:embed="rId87"/>
+                    <a:blip r:embed="rId86"/>
                     <a:stretch>
                       <a:fillRect/>
                     </a:stretch>
@@ -29224,76 +28543,9 @@
         <w:t xml:space="preserve">seria um erro de leitura.</w:t>
       </w:r>
     </w:p>
-    <w:p>
-      <w:pPr>
-        <w:pStyle w:val="FirstParagraph"/>
-      </w:pPr>
-      <w:r>
-        <w:t xml:space="preserve">Estes são os indicadores mais frágeis do relatório em termos de precisão: são</w:t>
-      </w:r>
-      <w:r>
-        <w:t xml:space="preserve"> </w:t>
-      </w:r>
-      <w:r>
-        <w:t xml:space="preserve">proporções calculadas sobre um subconjunto já pequeno — os desalentados, ou os</w:t>
-      </w:r>
-      <w:r>
-        <w:t xml:space="preserve"> </w:t>
-      </w:r>
-      <w:r>
-        <w:t xml:space="preserve">jovens nem-nem — e depois repartidas entre várias categorias de resposta. É</w:t>
-      </w:r>
-      <w:r>
-        <w:t xml:space="preserve"> </w:t>
-      </w:r>
-      <w:r>
-        <w:t xml:space="preserve">normal que a maioria das células apareça com CV alto nos estratos mais finos, e</w:t>
-      </w:r>
-      <w:r>
-        <w:t xml:space="preserve"> </w:t>
-      </w:r>
-      <w:r>
-        <w:t xml:space="preserve">elas devem ser lidas como indicativas, não conclusivas. As Tabelas 13 e 15 são</w:t>
-      </w:r>
-      <w:r>
-        <w:t xml:space="preserve"> </w:t>
-      </w:r>
-      <w:r>
-        <w:t xml:space="preserve">a exceção deliberada: como pedido, elas mostram categorias específicas</w:t>
-      </w:r>
-      <w:r>
-        <w:t xml:space="preserve"> </w:t>
-      </w:r>
-      <w:r>
-        <w:rPr>
-          <w:bCs/>
-          <w:b/>
-        </w:rPr>
-        <w:t xml:space="preserve">independentemente do CV</w:t>
-      </w:r>
-      <w:r>
-        <w:t xml:space="preserve"> </w:t>
-      </w:r>
-      <w:r>
-        <w:t xml:space="preserve">— a leitura deve se apoiar no IC ao lado de cada</w:t>
-      </w:r>
-      <w:r>
-        <w:t xml:space="preserve"> </w:t>
-      </w:r>
-      <w:r>
-        <w:t xml:space="preserve">estimativa, não na estimativa pontual sozinha.</w:t>
-      </w:r>
-    </w:p>
-    <w:p>
-      <w:r>
-        <w:pict>
-          <v:rect style="width:0;height:1.5pt" o:hralign="center" o:hrstd="t" o:hr="t"/>
-        </w:pict>
-      </w:r>
-    </w:p>
+    <w:bookmarkEnd w:id="89"/>
     <w:bookmarkEnd w:id="90"/>
-    <w:bookmarkEnd w:id="91"/>
-    <w:bookmarkStart w:id="95" w:name="X1abdfdd75baeef37c9c427c55f62adaf1f36130"/>
+    <w:bookmarkStart w:id="94" w:name="X1abdfdd75baeef37c9c427c55f62adaf1f36130"/>
     <w:p>
       <w:pPr>
         <w:pStyle w:val="Heading3"/>
@@ -30306,17 +29558,62 @@
         <w:pStyle w:val="BodyText"/>
       </w:pPr>
       <w:r>
+        <w:t xml:space="preserve">Duas leituras saltam da tabela. A primeira:</w:t>
+      </w:r>
+      <w:r>
+        <w:t xml:space="preserve"> </w:t>
+      </w:r>
+      <w:r>
         <w:rPr>
           <w:bCs/>
           <w:b/>
         </w:rPr>
-        <w:t xml:space="preserve">Como ler a tabela.</w:t>
+        <w:t xml:space="preserve">quase tudo difere entre territórios</w:t>
+      </w:r>
+      <w:r>
+        <w:t xml:space="preserve">. Nas quatro colunas em que</w:t>
       </w:r>
       <w:r>
         <w:t xml:space="preserve"> </w:t>
       </w:r>
       <w:r>
-        <w:t xml:space="preserve">Duas leituras saltam.</w:t>
+        <w:t xml:space="preserve">o teste se sustenta, a esmagadora maioria das células traz três asteriscos. O</w:t>
+      </w:r>
+      <w:r>
+        <w:t xml:space="preserve"> </w:t>
+      </w:r>
+      <w:r>
+        <w:t xml:space="preserve">Piauí não é homogêneo em praticamente nenhuma das dimensões medidas — e a</w:t>
+      </w:r>
+      <w:r>
+        <w:t xml:space="preserve"> </w:t>
+      </w:r>
+      <w:r>
+        <w:t xml:space="preserve">coluna</w:t>
+      </w:r>
+      <w:r>
+        <w:t xml:space="preserve"> </w:t>
+      </w:r>
+      <w:r>
+        <w:t xml:space="preserve">“</w:t>
+      </w:r>
+      <w:r>
+        <w:t xml:space="preserve">Teresina × resto</w:t>
+      </w:r>
+      <w:r>
+        <w:t xml:space="preserve">”</w:t>
+      </w:r>
+      <w:r>
+        <w:t xml:space="preserve"> </w:t>
+      </w:r>
+      <w:r>
+        <w:t xml:space="preserve">mostra que a capital se destaca do estado em dez dos</w:t>
+      </w:r>
+      <w:r>
+        <w:t xml:space="preserve"> </w:t>
+      </w:r>
+      <w:r>
+        <w:t xml:space="preserve">onze indicadores.</w:t>
       </w:r>
     </w:p>
     <w:p>
@@ -30324,7 +29621,7 @@
         <w:pStyle w:val="BodyText"/>
       </w:pPr>
       <w:r>
-        <w:t xml:space="preserve">A primeira:</w:t>
+        <w:t xml:space="preserve">A segunda é mais sutil e diz respeito ao</w:t>
       </w:r>
       <w:r>
         <w:t xml:space="preserve"> </w:t>
@@ -30334,52 +29631,84 @@
           <w:bCs/>
           <w:b/>
         </w:rPr>
-        <w:t xml:space="preserve">quase tudo difere entre territórios</w:t>
-      </w:r>
-      <w:r>
-        <w:t xml:space="preserve">. Nas quatro colunas em que</w:t>
+        <w:t xml:space="preserve">tipo</w:t>
       </w:r>
       <w:r>
         <w:t xml:space="preserve"> </w:t>
       </w:r>
       <w:r>
-        <w:t xml:space="preserve">o teste se sustenta, a esmagadora maioria das células traz três asteriscos. O</w:t>
+        <w:t xml:space="preserve">de indicador. Os três</w:t>
       </w:r>
       <w:r>
         <w:t xml:space="preserve"> </w:t>
       </w:r>
       <w:r>
-        <w:t xml:space="preserve">Piauí não é homogêneo em praticamente nenhuma das dimensões medidas — e a</w:t>
+        <w:t xml:space="preserve">primeiros — desocupação e suas variantes por posição no domicílio — são os</w:t>
       </w:r>
       <w:r>
         <w:t xml:space="preserve"> </w:t>
       </w:r>
       <w:r>
-        <w:t xml:space="preserve">coluna</w:t>
+        <w:t xml:space="preserve">únicos que oscilam entre significativo e não significativo conforme o recorte.</w:t>
       </w:r>
       <w:r>
         <w:t xml:space="preserve"> </w:t>
       </w:r>
       <w:r>
-        <w:t xml:space="preserve">“</w:t>
-      </w:r>
-      <w:r>
-        <w:t xml:space="preserve">Teresina × resto</w:t>
-      </w:r>
-      <w:r>
-        <w:t xml:space="preserve">”</w:t>
+        <w:t xml:space="preserve">Todos os demais, ligados a</w:t>
       </w:r>
       <w:r>
         <w:t xml:space="preserve"> </w:t>
       </w:r>
       <w:r>
-        <w:t xml:space="preserve">mostra que a capital se destaca do estado em dez dos</w:t>
+        <w:rPr>
+          <w:bCs/>
+          <w:b/>
+        </w:rPr>
+        <w:t xml:space="preserve">renda, informalidade e escolaridade</w:t>
+      </w:r>
+      <w:r>
+        <w:t xml:space="preserve">, são</w:t>
       </w:r>
       <w:r>
         <w:t xml:space="preserve"> </w:t>
       </w:r>
       <w:r>
-        <w:t xml:space="preserve">onze indicadores.</w:t>
+        <w:t xml:space="preserve">significativos em todos os cortes territoriais disponíveis. A diferença é</w:t>
+      </w:r>
+      <w:r>
+        <w:t xml:space="preserve"> </w:t>
+      </w:r>
+      <w:r>
+        <w:t xml:space="preserve">substantiva: estar desempregado é uma condição relativamente distribuída pelo</w:t>
+      </w:r>
+      <w:r>
+        <w:t xml:space="preserve"> </w:t>
+      </w:r>
+      <w:r>
+        <w:t xml:space="preserve">estado, enquanto</w:t>
+      </w:r>
+      <w:r>
+        <w:t xml:space="preserve"> </w:t>
+      </w:r>
+      <w:r>
+        <w:rPr>
+          <w:iCs/>
+          <w:i/>
+        </w:rPr>
+        <w:t xml:space="preserve">quanto se ganha e sob que vínculo</w:t>
+      </w:r>
+      <w:r>
+        <w:t xml:space="preserve"> </w:t>
+      </w:r>
+      <w:r>
+        <w:t xml:space="preserve">depende fortemente de onde</w:t>
+      </w:r>
+      <w:r>
+        <w:t xml:space="preserve"> </w:t>
+      </w:r>
+      <w:r>
+        <w:t xml:space="preserve">se mora.</w:t>
       </w:r>
     </w:p>
     <w:p>
@@ -30387,112 +29716,7 @@
         <w:pStyle w:val="BodyText"/>
       </w:pPr>
       <w:r>
-        <w:t xml:space="preserve">A segunda é mais sutil e diz respeito ao</w:t>
-      </w:r>
-      <w:r>
-        <w:t xml:space="preserve"> </w:t>
-      </w:r>
-      <w:r>
-        <w:rPr>
-          <w:bCs/>
-          <w:b/>
-        </w:rPr>
-        <w:t xml:space="preserve">tipo</w:t>
-      </w:r>
-      <w:r>
-        <w:t xml:space="preserve"> </w:t>
-      </w:r>
-      <w:r>
-        <w:t xml:space="preserve">de indicador. Os três</w:t>
-      </w:r>
-      <w:r>
-        <w:t xml:space="preserve"> </w:t>
-      </w:r>
-      <w:r>
-        <w:t xml:space="preserve">primeiros — desocupação e suas variantes por posição no domicílio — são os</w:t>
-      </w:r>
-      <w:r>
-        <w:t xml:space="preserve"> </w:t>
-      </w:r>
-      <w:r>
-        <w:t xml:space="preserve">únicos que oscilam entre significativo e não significativo conforme o recorte.</w:t>
-      </w:r>
-      <w:r>
-        <w:t xml:space="preserve"> </w:t>
-      </w:r>
-      <w:r>
-        <w:t xml:space="preserve">Todos os demais, ligados a</w:t>
-      </w:r>
-      <w:r>
-        <w:t xml:space="preserve"> </w:t>
-      </w:r>
-      <w:r>
-        <w:rPr>
-          <w:bCs/>
-          <w:b/>
-        </w:rPr>
-        <w:t xml:space="preserve">renda, informalidade e escolaridade</w:t>
-      </w:r>
-      <w:r>
-        <w:t xml:space="preserve">, são</w:t>
-      </w:r>
-      <w:r>
-        <w:t xml:space="preserve"> </w:t>
-      </w:r>
-      <w:r>
-        <w:t xml:space="preserve">significativos em todos os cortes territoriais disponíveis. A diferença é</w:t>
-      </w:r>
-      <w:r>
-        <w:t xml:space="preserve"> </w:t>
-      </w:r>
-      <w:r>
-        <w:t xml:space="preserve">substantiva: estar desempregado é uma condição relativamente distribuída pelo</w:t>
-      </w:r>
-      <w:r>
-        <w:t xml:space="preserve"> </w:t>
-      </w:r>
-      <w:r>
-        <w:t xml:space="preserve">estado, enquanto</w:t>
-      </w:r>
-      <w:r>
-        <w:t xml:space="preserve"> </w:t>
-      </w:r>
-      <w:r>
-        <w:rPr>
-          <w:iCs/>
-          <w:i/>
-        </w:rPr>
-        <w:t xml:space="preserve">quanto se ganha e sob que vínculo</w:t>
-      </w:r>
-      <w:r>
-        <w:t xml:space="preserve"> </w:t>
-      </w:r>
-      <w:r>
-        <w:t xml:space="preserve">depende fortemente de onde</w:t>
-      </w:r>
-      <w:r>
-        <w:t xml:space="preserve"> </w:t>
-      </w:r>
-      <w:r>
-        <w:t xml:space="preserve">se mora.</w:t>
-      </w:r>
-    </w:p>
-    <w:p>
-      <w:pPr>
-        <w:pStyle w:val="BodyText"/>
-      </w:pPr>
-      <w:r>
-        <w:rPr>
-          <w:bCs/>
-          <w:b/>
-        </w:rPr>
-        <w:t xml:space="preserve">Sobre a coluna do estrato de 7 dígitos.</w:t>
-      </w:r>
-      <w:r>
-        <w:t xml:space="preserve"> </w:t>
-      </w:r>
-      <w:r>
-        <w:t xml:space="preserve">Três indicadores trazem</w:t>
+        <w:t xml:space="preserve">Em relação a coluna do estrato de 7 dígitos.** Três indicadores trazem</w:t>
       </w:r>
       <w:r>
         <w:t xml:space="preserve"> </w:t>
@@ -30591,18 +29815,18 @@
           <wp:inline>
             <wp:extent cx="5334000" cy="10001250"/>
             <wp:effectExtent b="0" l="0" r="0" t="0"/>
-            <wp:docPr descr="ANOVA regional" title="" id="93" name="Picture"/>
+            <wp:docPr descr="ANOVA regional" title="" id="92" name="Picture"/>
             <a:graphic>
               <a:graphicData uri="http://schemas.openxmlformats.org/drawingml/2006/picture">
                 <pic:pic>
                   <pic:nvPicPr>
-                    <pic:cNvPr descr="./output/figuras/anova_regional_2026T2.png" id="94" name="Picture"/>
+                    <pic:cNvPr descr="./output/figuras/anova_regional_2026T2.png" id="93" name="Picture"/>
                     <pic:cNvPicPr>
                       <a:picLocks noChangeArrowheads="1" noChangeAspect="1"/>
                     </pic:cNvPicPr>
                   </pic:nvPicPr>
                   <pic:blipFill>
-                    <a:blip r:embed="rId92"/>
+                    <a:blip r:embed="rId91"/>
                     <a:stretch>
                       <a:fillRect/>
                     </a:stretch>
@@ -30684,208 +29908,24 @@
         <w:pStyle w:val="FirstParagraph"/>
       </w:pPr>
       <w:r>
-        <w:t xml:space="preserve">Duas observações que a leitura desta tabela exige.</w:t>
+        <w:t xml:space="preserve">Duas observações que a leitura desta tabela exige. A significância estatística não é relevância prática.** Uma diferença pode ser estatisticamente sólida e pequena demais para orientar política pública; e um</w:t>
+      </w:r>
+      <w:r>
+        <w:t xml:space="preserve"> </w:t>
+      </w:r>
+      <w:r>
+        <w:t xml:space="preserve">recorte com poucas observações pode não atingir significância diante de uma</w:t>
+      </w:r>
+      <w:r>
+        <w:t xml:space="preserve"> </w:t>
+      </w:r>
+      <w:r>
+        <w:t xml:space="preserve">diferença real e grande, por falta de amostra.</w:t>
       </w:r>
     </w:p>
-    <w:p>
-      <w:pPr>
-        <w:pStyle w:val="BodyText"/>
-      </w:pPr>
-      <w:r>
-        <w:rPr>
-          <w:bCs/>
-          <w:b/>
-        </w:rPr>
-        <w:t xml:space="preserve">Significância estatística não é relevância prática.</w:t>
-      </w:r>
-      <w:r>
-        <w:t xml:space="preserve"> </w:t>
-      </w:r>
-      <w:r>
-        <w:t xml:space="preserve">Uma diferença pode ser</w:t>
-      </w:r>
-      <w:r>
-        <w:t xml:space="preserve"> </w:t>
-      </w:r>
-      <w:r>
-        <w:t xml:space="preserve">estatisticamente sólida e pequena demais para orientar política pública; e um</w:t>
-      </w:r>
-      <w:r>
-        <w:t xml:space="preserve"> </w:t>
-      </w:r>
-      <w:r>
-        <w:t xml:space="preserve">recorte com poucas observações pode não atingir significância diante de uma</w:t>
-      </w:r>
-      <w:r>
-        <w:t xml:space="preserve"> </w:t>
-      </w:r>
-      <w:r>
-        <w:t xml:space="preserve">diferença real e grande, por falta de amostra. O teste responde</w:t>
-      </w:r>
-      <w:r>
-        <w:t xml:space="preserve"> </w:t>
-      </w:r>
-      <w:r>
-        <w:t xml:space="preserve">“</w:t>
-      </w:r>
-      <w:r>
-        <w:t xml:space="preserve">isto é</w:t>
-      </w:r>
-      <w:r>
-        <w:t xml:space="preserve"> </w:t>
-      </w:r>
-      <w:r>
-        <w:t xml:space="preserve">distinguível do acaso?</w:t>
-      </w:r>
-      <w:r>
-        <w:t xml:space="preserve">”</w:t>
-      </w:r>
-      <w:r>
-        <w:t xml:space="preserve">, não</w:t>
-      </w:r>
-      <w:r>
-        <w:t xml:space="preserve"> </w:t>
-      </w:r>
-      <w:r>
-        <w:t xml:space="preserve">“</w:t>
-      </w:r>
-      <w:r>
-        <w:t xml:space="preserve">isto importa?</w:t>
-      </w:r>
-      <w:r>
-        <w:t xml:space="preserve">”</w:t>
-      </w:r>
-      <w:r>
-        <w:t xml:space="preserve">.</w:t>
-      </w:r>
-    </w:p>
-    <w:p>
-      <w:pPr>
-        <w:pStyle w:val="BodyText"/>
-      </w:pPr>
-      <w:r>
-        <w:rPr>
-          <w:bCs/>
-          <w:b/>
-        </w:rPr>
-        <w:t xml:space="preserve">Os p-valores desta edição passaram por duas correções.</w:t>
-      </w:r>
-      <w:r>
-        <w:t xml:space="preserve"> </w:t>
-      </w:r>
-      <w:r>
-        <w:t xml:space="preserve">A primeira é de</w:t>
-      </w:r>
-      <w:r>
-        <w:t xml:space="preserve"> </w:t>
-      </w:r>
-      <w:r>
-        <w:t xml:space="preserve">calibração: o teste usado é a razão de verossimilhanças de Rao-Scott, e não o</w:t>
-      </w:r>
-      <w:r>
-        <w:t xml:space="preserve"> </w:t>
-      </w:r>
-      <w:r>
-        <w:t xml:space="preserve">teste de Wald, porque este último rejeitava a hipótese nula em metade das</w:t>
-      </w:r>
-      <w:r>
-        <w:t xml:space="preserve"> </w:t>
-      </w:r>
-      <w:r>
-        <w:t xml:space="preserve">vezes em que ela era verdadeira nos recortes com muitas categorias. A segunda</w:t>
-      </w:r>
-      <w:r>
-        <w:t xml:space="preserve"> </w:t>
-      </w:r>
-      <w:r>
-        <w:t xml:space="preserve">é de multiplicidade: com centenas de comparações por trimestre, parte da</w:t>
-      </w:r>
-      <w:r>
-        <w:t xml:space="preserve"> </w:t>
-      </w:r>
-      <w:r>
-        <w:t xml:space="preserve">significância bruta seria produto do volume de testes, e o ajuste desconta esse</w:t>
-      </w:r>
-      <w:r>
-        <w:t xml:space="preserve"> </w:t>
-      </w:r>
-      <w:r>
-        <w:t xml:space="preserve">efeito. Há ainda uma terceira, de natureza diferente: alguns cruzamentos</w:t>
-      </w:r>
-      <w:r>
-        <w:t xml:space="preserve"> </w:t>
-      </w:r>
-      <w:r>
-        <w:rPr>
-          <w:bCs/>
-          <w:b/>
-        </w:rPr>
-        <w:t xml:space="preserve">não</w:t>
-      </w:r>
-      <w:r>
-        <w:rPr>
-          <w:bCs/>
-          <w:b/>
-        </w:rPr>
-        <w:t xml:space="preserve"> </w:t>
-      </w:r>
-      <w:r>
-        <w:rPr>
-          <w:bCs/>
-          <w:b/>
-        </w:rPr>
-        <w:t xml:space="preserve">produzem teste algum</w:t>
-      </w:r>
-      <w:r>
-        <w:t xml:space="preserve">. Quando a matriz de covariância do modelo perde posto —</w:t>
-      </w:r>
-      <w:r>
-        <w:t xml:space="preserve"> </w:t>
-      </w:r>
-      <w:r>
-        <w:t xml:space="preserve">o que acontece em recortes de muitas categorias dentro de estratos pequenos —</w:t>
-      </w:r>
-      <w:r>
-        <w:t xml:space="preserve"> </w:t>
-      </w:r>
-      <w:r>
-        <w:t xml:space="preserve">o p-valor que sairia dali seria enviesado na direção de encontrar diferença.</w:t>
-      </w:r>
-      <w:r>
-        <w:t xml:space="preserve"> </w:t>
-      </w:r>
-      <w:r>
-        <w:t xml:space="preserve">Nesses casos o teste é refeito no recorte agregado, e se ainda assim não</w:t>
-      </w:r>
-      <w:r>
-        <w:t xml:space="preserve"> </w:t>
-      </w:r>
-      <w:r>
-        <w:t xml:space="preserve">sustentar, a célula fica vazia. Uma lacuna honesta vale mais que um asterisco</w:t>
-      </w:r>
-      <w:r>
-        <w:t xml:space="preserve"> </w:t>
-      </w:r>
-      <w:r>
-        <w:t xml:space="preserve">inventado. O anexo metodológico (seções 6.4, 6.5 e 6.8) documenta as três, com</w:t>
-      </w:r>
-      <w:r>
-        <w:t xml:space="preserve"> </w:t>
-      </w:r>
-      <w:r>
-        <w:t xml:space="preserve">as simulações e os diagnósticos que as motivaram.</w:t>
-      </w:r>
-    </w:p>
-    <w:p>
-      <w:r>
-        <w:pict>
-          <v:rect style="width:0;height:1.5pt" o:hralign="center" o:hrstd="t" o:hr="t"/>
-        </w:pict>
-      </w:r>
-    </w:p>
+    <w:bookmarkEnd w:id="94"/>
     <w:bookmarkEnd w:id="95"/>
-    <w:bookmarkEnd w:id="96"/>
-    <w:bookmarkStart w:id="97" w:name="considerações-finais"/>
+    <w:bookmarkStart w:id="96" w:name="considerações-finais"/>
     <w:p>
       <w:pPr>
         <w:pStyle w:val="Heading2"/>
@@ -30930,8 +29970,7 @@
         <w:t xml:space="preserve">— ressalvas de encerramento — repetir que as estatísticas por estrato são experimentais e que estimativas com CV acima de 15% não sustentam conclusão.</w:t>
       </w:r>
     </w:p>
-    <w:bookmarkEnd w:id="97"/>
-    <w:bookmarkEnd w:id="98"/>
+    <w:bookmarkEnd w:id="96"/>
     <w:sectPr/>
   </w:body>
 </w:document>

</xml_diff>